<commit_message>
docs: refine proposal pagination and remove superseded main files
</commit_message>
<xml_diff>
--- a/report/proposal_outline/许哲圣_本科毕业论文开题报告.docx
+++ b/report/proposal_outline/许哲圣_本科毕业论文开题报告.docx
@@ -465,6 +465,12 @@
           <w:tcPr>
             <w:tcW w:w="2263" w:type="dxa"/>
             <w:vAlign w:val="center"/>
+            <w:tcMar>
+              <w:left w:w="120" w:type="dxa"/>
+              <w:right w:w="120" w:type="dxa"/>
+              <w:top w:w="70" w:type="dxa"/>
+              <w:bottom w:w="70" w:type="dxa"/>
+            </w:tcMar>
           </w:tcPr>
           <w:p>
             <w:pPr>
@@ -476,6 +482,9 @@
                 <w:sz w:val="24"/>
                 <w:szCs w:val="24"/>
               </w:rPr>
+              <w:snapToGrid w:val="0"/>
+              <w:keepNext w:val="0"/>
+              <w:spacing w:before="80" w:after="60" w:line="320" w:lineRule="exact"/>
             </w:pPr>
             <w:r>
               <w:rPr>
@@ -493,11 +502,17 @@
           <w:tcPr>
             <w:tcW w:w="2273" w:type="dxa"/>
             <w:vAlign w:val="center"/>
+            <w:tcMar>
+              <w:left w:w="120" w:type="dxa"/>
+              <w:right w:w="120" w:type="dxa"/>
+              <w:top w:w="70" w:type="dxa"/>
+              <w:bottom w:w="70" w:type="dxa"/>
+            </w:tcMar>
           </w:tcPr>
           <w:p>
             <w:pPr>
               <w:jc w:val="center"/>
-              <w:spacing w:before="0" w:after="65" w:line="360" w:lineRule="exact"/>
+              <w:spacing w:before="0" w:after="45" w:line="320" w:lineRule="exact"/>
               <w:snapToGrid w:val="0"/>
               <w:widowControl/>
               <w:keepNext w:val="0"/>
@@ -515,7 +530,7 @@
           <w:p>
             <w:pPr>
               <w:jc w:val="center"/>
-              <w:spacing w:before="0" w:after="65" w:line="360" w:lineRule="exact"/>
+              <w:spacing w:before="0" w:after="45" w:line="320" w:lineRule="exact"/>
               <w:snapToGrid w:val="0"/>
               <w:widowControl/>
               <w:keepNext w:val="0"/>
@@ -535,6 +550,12 @@
           <w:tcPr>
             <w:tcW w:w="2275" w:type="dxa"/>
             <w:vAlign w:val="center"/>
+            <w:tcMar>
+              <w:left w:w="120" w:type="dxa"/>
+              <w:right w:w="120" w:type="dxa"/>
+              <w:top w:w="70" w:type="dxa"/>
+              <w:bottom w:w="70" w:type="dxa"/>
+            </w:tcMar>
           </w:tcPr>
           <w:p>
             <w:pPr>
@@ -546,6 +567,9 @@
                 <w:sz w:val="24"/>
                 <w:szCs w:val="24"/>
               </w:rPr>
+              <w:snapToGrid w:val="0"/>
+              <w:keepNext w:val="0"/>
+              <w:spacing w:before="80" w:after="60" w:line="320" w:lineRule="exact"/>
             </w:pPr>
             <w:r>
               <w:rPr>
@@ -563,11 +587,17 @@
           <w:tcPr>
             <w:tcW w:w="1625" w:type="dxa"/>
             <w:vAlign w:val="center"/>
+            <w:tcMar>
+              <w:left w:w="120" w:type="dxa"/>
+              <w:right w:w="120" w:type="dxa"/>
+              <w:top w:w="70" w:type="dxa"/>
+              <w:bottom w:w="70" w:type="dxa"/>
+            </w:tcMar>
           </w:tcPr>
           <w:p>
             <w:pPr>
               <w:jc w:val="center"/>
-              <w:spacing w:before="0" w:after="65" w:line="360" w:lineRule="exact"/>
+              <w:spacing w:before="0" w:after="45" w:line="320" w:lineRule="exact"/>
               <w:snapToGrid w:val="0"/>
               <w:widowControl/>
               <w:keepNext w:val="0"/>
@@ -608,11 +638,17 @@
           <w:tcPr>
             <w:tcW w:w="8436" w:type="dxa"/>
             <w:gridSpan w:val="4"/>
+            <w:tcMar>
+              <w:left w:w="120" w:type="dxa"/>
+              <w:right w:w="120" w:type="dxa"/>
+              <w:top w:w="70" w:type="dxa"/>
+              <w:bottom w:w="70" w:type="dxa"/>
+            </w:tcMar>
           </w:tcPr>
           <w:p>
             <w:pPr>
               <w:jc w:val="left"/>
-              <w:spacing w:before="100" w:after="80" w:line="360" w:lineRule="exact"/>
+              <w:spacing w:before="80" w:after="60" w:line="320" w:lineRule="exact"/>
               <w:snapToGrid w:val="0"/>
               <w:widowControl/>
               <w:keepNext w:val="0"/>
@@ -632,7 +668,7 @@
           <w:p>
             <w:pPr>
               <w:jc w:val="both"/>
-              <w:spacing w:before="0" w:after="65" w:line="360" w:lineRule="exact"/>
+              <w:spacing w:before="0" w:after="45" w:line="320" w:lineRule="exact"/>
               <w:snapToGrid w:val="0"/>
               <w:widowControl/>
               <w:keepNext w:val="0"/>
@@ -651,7 +687,7 @@
           <w:p>
             <w:pPr>
               <w:jc w:val="both"/>
-              <w:spacing w:before="0" w:after="65" w:line="360" w:lineRule="exact"/>
+              <w:spacing w:before="0" w:after="45" w:line="320" w:lineRule="exact"/>
               <w:snapToGrid w:val="0"/>
               <w:widowControl/>
               <w:keepNext w:val="0"/>
@@ -670,7 +706,7 @@
           <w:p>
             <w:pPr>
               <w:jc w:val="both"/>
-              <w:spacing w:before="0" w:after="65" w:line="360" w:lineRule="exact"/>
+              <w:spacing w:before="0" w:after="45" w:line="320" w:lineRule="exact"/>
               <w:snapToGrid w:val="0"/>
               <w:widowControl/>
               <w:keepNext w:val="0"/>
@@ -712,11 +748,17 @@
           <w:tcPr>
             <w:tcW w:w="8436" w:type="dxa"/>
             <w:gridSpan w:val="4"/>
+            <w:tcMar>
+              <w:left w:w="120" w:type="dxa"/>
+              <w:right w:w="120" w:type="dxa"/>
+              <w:top w:w="70" w:type="dxa"/>
+              <w:bottom w:w="70" w:type="dxa"/>
+            </w:tcMar>
           </w:tcPr>
           <w:p>
             <w:pPr>
               <w:jc w:val="left"/>
-              <w:spacing w:before="100" w:after="80" w:line="360" w:lineRule="exact"/>
+              <w:spacing w:before="80" w:after="60" w:line="320" w:lineRule="exact"/>
               <w:snapToGrid w:val="0"/>
               <w:widowControl/>
               <w:keepNext w:val="0"/>
@@ -736,7 +778,7 @@
           <w:p>
             <w:pPr>
               <w:jc w:val="both"/>
-              <w:spacing w:before="0" w:after="65" w:line="360" w:lineRule="exact"/>
+              <w:spacing w:before="0" w:after="45" w:line="320" w:lineRule="exact"/>
               <w:snapToGrid w:val="0"/>
               <w:widowControl/>
               <w:keepNext w:val="0"/>
@@ -755,7 +797,7 @@
           <w:p>
             <w:pPr>
               <w:jc w:val="both"/>
-              <w:spacing w:before="0" w:after="65" w:line="360" w:lineRule="exact"/>
+              <w:spacing w:before="0" w:after="45" w:line="320" w:lineRule="exact"/>
               <w:snapToGrid w:val="0"/>
               <w:widowControl/>
               <w:keepNext w:val="0"/>
@@ -774,7 +816,7 @@
           <w:p>
             <w:pPr>
               <w:jc w:val="both"/>
-              <w:spacing w:before="0" w:after="65" w:line="360" w:lineRule="exact"/>
+              <w:spacing w:before="0" w:after="45" w:line="320" w:lineRule="exact"/>
               <w:snapToGrid w:val="0"/>
               <w:widowControl/>
               <w:keepNext w:val="0"/>
@@ -793,7 +835,7 @@
           <w:p>
             <w:pPr>
               <w:jc w:val="both"/>
-              <w:spacing w:before="0" w:after="65" w:line="360" w:lineRule="exact"/>
+              <w:spacing w:before="0" w:after="45" w:line="320" w:lineRule="exact"/>
               <w:snapToGrid w:val="0"/>
               <w:widowControl/>
               <w:keepNext w:val="0"/>
@@ -807,277 +849,46 @@
                 <w:szCs w:val="24"/>
               </w:rPr>
               <w:t xml:space="preserve">预测收益短缺的平方惩罚需要区分数学形式与经济解释。Nocedal 与 Wright[10]介绍不等式违反量的二次罚函数；Boyd 等[11]讨论组合优化中以惩罚处理软约束。这为对低于目标的预测收益差额取正部并平方提供了方法支撑。Siegmann 与 Lucas[12]研究损失厌恶偏好下的财务规划，对基准财富以下的随机短缺使用二次惩罚。本文惩罚的是预测均值的不足，与随机财富短缺的期望并不相同，引用时将明确这一边界。</w:t>
-            </w:r>
-          </w:p>
-          <w:p>
-            <w:pPr>
-              <w:jc w:val="both"/>
-              <w:spacing w:before="0" w:after="65" w:line="360" w:lineRule="exact"/>
-              <w:snapToGrid w:val="0"/>
-              <w:widowControl/>
-              <w:keepNext w:val="0"/>
-              <w:ind w:firstLine="480"/>
-            </w:pPr>
-            <w:r>
-              <w:rPr>
-                <w:rFonts w:ascii="Times New Roman" w:hAnsi="Times New Roman" w:eastAsia="宋体" w:cs="Times New Roman"/>
-                <w:color w:val="000000"/>
-                <w:sz w:val="24"/>
-                <w:szCs w:val="24"/>
-              </w:rPr>
-              <w:t xml:space="preserve">上述文献能够支持模型中各项设定的来源。本文拟将风险预算参考、方差控制和预测收益短缺整合为两阶段凸模型，采用仅使用历史信息的年度参数更新，并通过对照实验评价其必要性。文献依据说明建模选择有合理来源，最终配置是否有效仍由真实数据检验。</w:t>
-            </w:r>
-          </w:p>
-          <w:p>
-            <w:pPr>
-              <w:jc w:val="left"/>
-              <w:spacing w:before="100" w:after="80" w:line="360" w:lineRule="exact"/>
-              <w:snapToGrid w:val="0"/>
-              <w:widowControl/>
-              <w:keepNext w:val="0"/>
-              <w:keepLines/>
-            </w:pPr>
-            <w:r>
-              <w:rPr>
-                <w:rFonts w:ascii="Times New Roman" w:hAnsi="Times New Roman" w:eastAsia="仿宋" w:cs="Times New Roman"/>
-                <w:color w:val="000000"/>
-                <w:sz w:val="24"/>
-                <w:szCs w:val="24"/>
-                <w:b/>
-              </w:rPr>
-              <w:t xml:space="preserve">主要参考文献</w:t>
-            </w:r>
-          </w:p>
-          <w:p>
-            <w:pPr>
-              <w:jc w:val="left"/>
-              <w:spacing w:before="0" w:after="65" w:line="280" w:lineRule="exact"/>
-              <w:snapToGrid w:val="0"/>
-              <w:widowControl/>
-              <w:keepNext w:val="0"/>
-              <w:ind w:left="360" w:hanging="360"/>
-            </w:pPr>
-            <w:r>
-              <w:rPr>
-                <w:rFonts w:ascii="Times New Roman" w:hAnsi="Times New Roman" w:eastAsia="宋体" w:cs="Times New Roman"/>
-                <w:color w:val="000000"/>
-                <w:sz w:val="21"/>
-                <w:szCs w:val="21"/>
-              </w:rPr>
-              <w:t xml:space="preserve">[1] 王志强, 赵庆. 跟踪误差投资组合鲁棒优化模型及其衍生模型在基金市场中的应用[J]. 山东财经大学学报, 2015, 27(1): 1-8.</w:t>
-            </w:r>
-          </w:p>
-          <w:p>
-            <w:pPr>
-              <w:jc w:val="left"/>
-              <w:spacing w:before="0" w:after="65" w:line="280" w:lineRule="exact"/>
-              <w:snapToGrid w:val="0"/>
-              <w:widowControl/>
-              <w:keepNext w:val="0"/>
-              <w:ind w:left="360" w:hanging="360"/>
-            </w:pPr>
-            <w:r>
-              <w:rPr>
-                <w:rFonts w:ascii="Times New Roman" w:hAnsi="Times New Roman" w:eastAsia="宋体" w:cs="Times New Roman"/>
-                <w:color w:val="000000"/>
-                <w:sz w:val="21"/>
-                <w:szCs w:val="21"/>
-              </w:rPr>
-              <w:t xml:space="preserve">[2] 刘家和, 金秀, 苑莹, 等. 状态依赖和损失厌恶下的鲁棒投资组合模型及实证[J]. 管理工程学报, 2018, 32(2): 196-201.</w:t>
-            </w:r>
-          </w:p>
-          <w:p>
-            <w:pPr>
-              <w:jc w:val="left"/>
-              <w:spacing w:before="0" w:after="65" w:line="280" w:lineRule="exact"/>
-              <w:snapToGrid w:val="0"/>
-              <w:widowControl/>
-              <w:keepNext w:val="0"/>
-              <w:ind w:left="360" w:hanging="360"/>
-            </w:pPr>
-            <w:r>
-              <w:rPr>
-                <w:rFonts w:ascii="Times New Roman" w:hAnsi="Times New Roman" w:eastAsia="宋体" w:cs="Times New Roman"/>
-                <w:color w:val="000000"/>
-                <w:sz w:val="21"/>
-                <w:szCs w:val="21"/>
-              </w:rPr>
-              <w:t xml:space="preserve">[3] 王宗润, 何瑭瑭. 基于动态参照点的鲁棒投资组合模型及其拓展[J]. 运筹与管理, 2021, 30(6): 124-131.</w:t>
-            </w:r>
-          </w:p>
-          <w:p>
-            <w:pPr>
-              <w:jc w:val="left"/>
-              <w:spacing w:before="0" w:after="65" w:line="280" w:lineRule="exact"/>
-              <w:snapToGrid w:val="0"/>
-              <w:widowControl/>
-              <w:keepNext w:val="0"/>
-              <w:ind w:left="360" w:hanging="360"/>
-            </w:pPr>
-            <w:r>
-              <w:rPr>
-                <w:rFonts w:ascii="Times New Roman" w:hAnsi="Times New Roman" w:eastAsia="宋体" w:cs="Times New Roman"/>
-                <w:color w:val="000000"/>
-                <w:sz w:val="21"/>
-                <w:szCs w:val="21"/>
-              </w:rPr>
-              <w:t xml:space="preserve">[4] 景奎. 基于 ESG 整合的双层风险预算投资组合模型研究[J]. 统计与信息论坛, 2026, 41(9): 65-75.</w:t>
-            </w:r>
-          </w:p>
-          <w:p>
-            <w:pPr>
-              <w:jc w:val="left"/>
-              <w:spacing w:before="0" w:after="65" w:line="280" w:lineRule="exact"/>
-              <w:snapToGrid w:val="0"/>
-              <w:widowControl/>
-              <w:keepNext w:val="0"/>
-              <w:ind w:left="360" w:hanging="360"/>
-            </w:pPr>
-            <w:r>
-              <w:rPr>
-                <w:rFonts w:ascii="Times New Roman" w:hAnsi="Times New Roman" w:eastAsia="宋体" w:cs="Times New Roman"/>
-                <w:color w:val="000000"/>
-                <w:sz w:val="21"/>
-                <w:szCs w:val="21"/>
-              </w:rPr>
-              <w:t xml:space="preserve">[5] MARKOWITZ H M. Portfolio Selection: Efficient Diversification of Investments[M]. New York: John Wiley &amp; Sons, 1959.</w:t>
-            </w:r>
-          </w:p>
-          <w:p>
-            <w:pPr>
-              <w:jc w:val="left"/>
-              <w:spacing w:before="0" w:after="65" w:line="280" w:lineRule="exact"/>
-              <w:snapToGrid w:val="0"/>
-              <w:widowControl/>
-              <w:keepNext w:val="0"/>
-              <w:ind w:left="360" w:hanging="360"/>
-            </w:pPr>
-            <w:r>
-              <w:rPr>
-                <w:rFonts w:ascii="Times New Roman" w:hAnsi="Times New Roman" w:eastAsia="宋体" w:cs="Times New Roman"/>
-                <w:color w:val="000000"/>
-                <w:sz w:val="21"/>
-                <w:szCs w:val="21"/>
-              </w:rPr>
-              <w:t xml:space="preserve">[6] SPINU F. An Algorithm for Computing Risk Parity Weights[R]. SSRN, 2013. DOI 10.2139/ssrn.2297383.</w:t>
-            </w:r>
-          </w:p>
-          <w:p>
-            <w:pPr>
-              <w:jc w:val="left"/>
-              <w:spacing w:before="0" w:after="65" w:line="280" w:lineRule="exact"/>
-              <w:snapToGrid w:val="0"/>
-              <w:widowControl/>
-              <w:keepNext w:val="0"/>
-              <w:ind w:left="360" w:hanging="360"/>
-            </w:pPr>
-            <w:r>
-              <w:rPr>
-                <w:rFonts w:ascii="Times New Roman" w:hAnsi="Times New Roman" w:eastAsia="宋体" w:cs="Times New Roman"/>
-                <w:color w:val="000000"/>
-                <w:sz w:val="21"/>
-                <w:szCs w:val="21"/>
-              </w:rPr>
-              <w:t xml:space="preserve">[7] FENG Y, PALOMAR D P. SCRIP: Successive Convex Optimization Methods for Risk Parity Portfolio Design[J]. IEEE Transactions on Signal Processing, 2015, 63(19): 5285-5300.</w:t>
-            </w:r>
-          </w:p>
-          <w:p>
-            <w:pPr>
-              <w:jc w:val="left"/>
-              <w:spacing w:before="0" w:after="65" w:line="280" w:lineRule="exact"/>
-              <w:snapToGrid w:val="0"/>
-              <w:widowControl/>
-              <w:keepNext w:val="0"/>
-              <w:ind w:left="360" w:hanging="360"/>
-            </w:pPr>
-            <w:r>
-              <w:rPr>
-                <w:rFonts w:ascii="Times New Roman" w:hAnsi="Times New Roman" w:eastAsia="宋体" w:cs="Times New Roman"/>
-                <w:color w:val="000000"/>
-                <w:sz w:val="21"/>
-                <w:szCs w:val="21"/>
-              </w:rPr>
-              <w:t xml:space="preserve">[8] BOURGERON T, LEZMI E, RONCALLI T. Robust Asset Allocation for Robo-Advisors[R]. Paris: Amundi Asset Management, 2018.</w:t>
-            </w:r>
-          </w:p>
-          <w:p>
-            <w:pPr>
-              <w:jc w:val="left"/>
-              <w:spacing w:before="0" w:after="65" w:line="280" w:lineRule="exact"/>
-              <w:snapToGrid w:val="0"/>
-              <w:widowControl/>
-              <w:keepNext w:val="0"/>
-              <w:ind w:left="360" w:hanging="360"/>
-            </w:pPr>
-            <w:r>
-              <w:rPr>
-                <w:rFonts w:ascii="Times New Roman" w:hAnsi="Times New Roman" w:eastAsia="宋体" w:cs="Times New Roman"/>
-                <w:color w:val="000000"/>
-                <w:sz w:val="21"/>
-                <w:szCs w:val="21"/>
-              </w:rPr>
-              <w:t xml:space="preserve">[9] GAMBETA V, KWON R. Risk Return Trade-Off in Relaxed Risk Parity Portfolio Optimization[J]. Journal of Risk and Financial Management, 2020, 13(10): 237.</w:t>
-            </w:r>
-          </w:p>
-          <w:p>
-            <w:pPr>
-              <w:jc w:val="left"/>
-              <w:spacing w:before="0" w:after="65" w:line="280" w:lineRule="exact"/>
-              <w:snapToGrid w:val="0"/>
-              <w:widowControl/>
-              <w:keepNext w:val="0"/>
-              <w:ind w:left="360" w:hanging="360"/>
-            </w:pPr>
-            <w:r>
-              <w:rPr>
-                <w:rFonts w:ascii="Times New Roman" w:hAnsi="Times New Roman" w:eastAsia="宋体" w:cs="Times New Roman"/>
-                <w:color w:val="000000"/>
-                <w:sz w:val="21"/>
-                <w:szCs w:val="21"/>
-              </w:rPr>
-              <w:t xml:space="preserve">[10] NOCEDAL J, WRIGHT S J. Numerical Optimization[M]. 2nd ed. New York: Springer, 2006.</w:t>
-            </w:r>
-          </w:p>
-          <w:p>
-            <w:pPr>
-              <w:jc w:val="left"/>
-              <w:spacing w:before="0" w:after="65" w:line="280" w:lineRule="exact"/>
-              <w:snapToGrid w:val="0"/>
-              <w:widowControl/>
-              <w:keepNext w:val="0"/>
-              <w:ind w:left="360" w:hanging="360"/>
-            </w:pPr>
-            <w:r>
-              <w:rPr>
-                <w:rFonts w:ascii="Times New Roman" w:hAnsi="Times New Roman" w:eastAsia="宋体" w:cs="Times New Roman"/>
-                <w:color w:val="000000"/>
-                <w:sz w:val="21"/>
-                <w:szCs w:val="21"/>
-              </w:rPr>
-              <w:t xml:space="preserve">[11] BOYD S, BUSSETI E, DIAMOND S, et al. Multi-Period Trading via Convex Optimization[J]. Foundations and Trends in Optimization, 2017, 3(1): 1-76.</w:t>
-            </w:r>
-          </w:p>
-          <w:p>
-            <w:pPr>
-              <w:jc w:val="left"/>
-              <w:spacing w:before="0" w:after="65" w:line="280" w:lineRule="exact"/>
-              <w:snapToGrid w:val="0"/>
-              <w:widowControl/>
-              <w:keepNext w:val="0"/>
-              <w:ind w:left="360" w:hanging="360"/>
-            </w:pPr>
-            <w:r>
-              <w:rPr>
-                <w:rFonts w:ascii="Times New Roman" w:hAnsi="Times New Roman" w:eastAsia="宋体" w:cs="Times New Roman"/>
-                <w:color w:val="000000"/>
-                <w:sz w:val="21"/>
-                <w:szCs w:val="21"/>
-              </w:rPr>
-              <w:t xml:space="preserve">[12] SIEGMANN A, LUCAS A. Discrete-Time Financial Planning Models Under Loss-Averse Preferences[J]. Operations Research, 2005, 53(3): 403-414.</w:t>
             </w:r>
           </w:p>
         </w:tc>
       </w:tr>
+    </w:tbl>
+    <w:p>
+      <w:pPr>
+        <w:spacing w:before="0" w:after="0" w:line="20" w:lineRule="exact"/>
+      </w:pPr>
+      <w:r>
+        <w:br w:type="page"/>
+      </w:r>
+    </w:p>
+    <w:tbl>
+      <w:tblPr>
+        <w:tblStyle w:val="5"/>
+        <w:tblW w:w="8436" w:type="dxa"/>
+        <w:tblInd w:w="0" w:type="dxa"/>
+        <w:tblBorders>
+          <w:top w:val="single" w:color="auto" w:sz="4" w:space="0"/>
+          <w:left w:val="single" w:color="auto" w:sz="4" w:space="0"/>
+          <w:bottom w:val="single" w:color="auto" w:sz="4" w:space="0"/>
+          <w:right w:val="single" w:color="auto" w:sz="4" w:space="0"/>
+          <w:insideH w:val="single" w:color="auto" w:sz="4" w:space="0"/>
+          <w:insideV w:val="single" w:color="auto" w:sz="4" w:space="0"/>
+        </w:tblBorders>
+        <w:tblLayout w:type="fixed"/>
+        <w:tblCellMar>
+          <w:top w:w="0" w:type="dxa"/>
+          <w:left w:w="108" w:type="dxa"/>
+          <w:bottom w:w="0" w:type="dxa"/>
+          <w:right w:w="108" w:type="dxa"/>
+        </w:tblCellMar>
+      </w:tblPr>
+      <w:tblGrid>
+        <w:gridCol w:w="2263"/>
+        <w:gridCol w:w="2273"/>
+        <w:gridCol w:w="2275"/>
+        <w:gridCol w:w="1625"/>
+      </w:tblGrid>
       <w:tr>
         <w:tblPrEx>
           <w:tblBorders>
@@ -1102,11 +913,36 @@
           <w:tcPr>
             <w:tcW w:w="8436" w:type="dxa"/>
             <w:gridSpan w:val="4"/>
+            <w:tcMar>
+              <w:left w:w="120" w:type="dxa"/>
+              <w:right w:w="120" w:type="dxa"/>
+              <w:top w:w="70" w:type="dxa"/>
+              <w:bottom w:w="70" w:type="dxa"/>
+            </w:tcMar>
           </w:tcPr>
           <w:p>
             <w:pPr>
-              <w:jc w:val="left"/>
-              <w:spacing w:before="100" w:after="80" w:line="360" w:lineRule="exact"/>
+              <w:jc w:val="both"/>
+              <w:spacing w:before="0" w:after="45" w:line="320" w:lineRule="exact"/>
+              <w:snapToGrid w:val="0"/>
+              <w:widowControl/>
+              <w:keepNext w:val="0"/>
+              <w:ind w:firstLine="480"/>
+            </w:pPr>
+            <w:r>
+              <w:rPr>
+                <w:rFonts w:ascii="Times New Roman" w:hAnsi="Times New Roman" w:eastAsia="宋体" w:cs="Times New Roman"/>
+                <w:color w:val="000000"/>
+                <w:sz w:val="24"/>
+                <w:szCs w:val="24"/>
+              </w:rPr>
+              <w:t xml:space="preserve">上述文献能够支持模型中各项设定的来源。本文拟将风险预算参考、方差控制和预测收益短缺整合为两阶段凸模型，采用仅使用历史信息的年度参数更新，并通过对照实验评价其必要性。文献依据说明建模选择有合理来源，最终配置是否有效仍由真实数据检验。</w:t>
+            </w:r>
+          </w:p>
+          <w:p>
+            <w:pPr>
+              <w:jc w:val="left"/>
+              <w:spacing w:before="80" w:after="60" w:line="320" w:lineRule="exact"/>
               <w:snapToGrid w:val="0"/>
               <w:widowControl/>
               <w:keepNext w:val="0"/>
@@ -1120,13 +956,342 @@
                 <w:szCs w:val="24"/>
                 <w:b/>
               </w:rPr>
+              <w:t xml:space="preserve">主要参考文献</w:t>
+            </w:r>
+          </w:p>
+          <w:p>
+            <w:pPr>
+              <w:jc w:val="left"/>
+              <w:spacing w:before="0" w:after="45" w:line="280" w:lineRule="exact"/>
+              <w:snapToGrid w:val="0"/>
+              <w:widowControl/>
+              <w:keepNext w:val="0"/>
+              <w:ind w:left="360" w:hanging="360"/>
+              <w:keepLines w:val="1"/>
+            </w:pPr>
+            <w:r>
+              <w:rPr>
+                <w:rFonts w:ascii="Times New Roman" w:hAnsi="Times New Roman" w:eastAsia="宋体" w:cs="Times New Roman"/>
+                <w:color w:val="000000"/>
+                <w:sz w:val="21"/>
+                <w:szCs w:val="21"/>
+              </w:rPr>
+              <w:t xml:space="preserve">[1] 王志强, 赵庆. 跟踪误差投资组合鲁棒优化模型及其衍生模型在基金市场中的应用[J]. 山东财经大学学报, 2015, 27(1): 1-8.</w:t>
+            </w:r>
+          </w:p>
+          <w:p>
+            <w:pPr>
+              <w:jc w:val="left"/>
+              <w:spacing w:before="0" w:after="45" w:line="280" w:lineRule="exact"/>
+              <w:snapToGrid w:val="0"/>
+              <w:widowControl/>
+              <w:keepNext w:val="0"/>
+              <w:ind w:left="360" w:hanging="360"/>
+              <w:keepLines w:val="1"/>
+            </w:pPr>
+            <w:r>
+              <w:rPr>
+                <w:rFonts w:ascii="Times New Roman" w:hAnsi="Times New Roman" w:eastAsia="宋体" w:cs="Times New Roman"/>
+                <w:color w:val="000000"/>
+                <w:sz w:val="21"/>
+                <w:szCs w:val="21"/>
+              </w:rPr>
+              <w:t xml:space="preserve">[2] 刘家和, 金秀, 苑莹, 等. 状态依赖和损失厌恶下的鲁棒投资组合模型及实证[J]. 管理工程学报, 2018, 32(2): 196-201.</w:t>
+            </w:r>
+          </w:p>
+          <w:p>
+            <w:pPr>
+              <w:jc w:val="left"/>
+              <w:spacing w:before="0" w:after="45" w:line="280" w:lineRule="exact"/>
+              <w:snapToGrid w:val="0"/>
+              <w:widowControl/>
+              <w:keepNext w:val="0"/>
+              <w:ind w:left="360" w:hanging="360"/>
+              <w:keepLines w:val="1"/>
+            </w:pPr>
+            <w:r>
+              <w:rPr>
+                <w:rFonts w:ascii="Times New Roman" w:hAnsi="Times New Roman" w:eastAsia="宋体" w:cs="Times New Roman"/>
+                <w:color w:val="000000"/>
+                <w:sz w:val="21"/>
+                <w:szCs w:val="21"/>
+              </w:rPr>
+              <w:t xml:space="preserve">[3] 王宗润, 何瑭瑭. 基于动态参照点的鲁棒投资组合模型及其拓展[J]. 运筹与管理, 2021, 30(6): 124-131.</w:t>
+            </w:r>
+          </w:p>
+          <w:p>
+            <w:pPr>
+              <w:jc w:val="left"/>
+              <w:spacing w:before="0" w:after="45" w:line="280" w:lineRule="exact"/>
+              <w:snapToGrid w:val="0"/>
+              <w:widowControl/>
+              <w:keepNext w:val="0"/>
+              <w:ind w:left="360" w:hanging="360"/>
+              <w:keepLines w:val="1"/>
+            </w:pPr>
+            <w:r>
+              <w:rPr>
+                <w:rFonts w:ascii="Times New Roman" w:hAnsi="Times New Roman" w:eastAsia="宋体" w:cs="Times New Roman"/>
+                <w:color w:val="000000"/>
+                <w:sz w:val="21"/>
+                <w:szCs w:val="21"/>
+              </w:rPr>
+              <w:t xml:space="preserve">[4] 景奎. 基于 ESG 整合的双层风险预算投资组合模型研究[J]. 统计与信息论坛, 2026, 41(9): 65-75.</w:t>
+            </w:r>
+          </w:p>
+          <w:p>
+            <w:pPr>
+              <w:jc w:val="left"/>
+              <w:spacing w:before="0" w:after="45" w:line="280" w:lineRule="exact"/>
+              <w:snapToGrid w:val="0"/>
+              <w:widowControl/>
+              <w:keepNext w:val="0"/>
+              <w:ind w:left="360" w:hanging="360"/>
+              <w:keepLines w:val="1"/>
+            </w:pPr>
+            <w:r>
+              <w:rPr>
+                <w:rFonts w:ascii="Times New Roman" w:hAnsi="Times New Roman" w:eastAsia="宋体" w:cs="Times New Roman"/>
+                <w:color w:val="000000"/>
+                <w:sz w:val="21"/>
+                <w:szCs w:val="21"/>
+              </w:rPr>
+              <w:t xml:space="preserve">[5] MARKOWITZ H M. Portfolio Selection: Efficient Diversification of Investments[M]. New York: John Wiley &amp; Sons, 1959.</w:t>
+            </w:r>
+          </w:p>
+          <w:p>
+            <w:pPr>
+              <w:jc w:val="left"/>
+              <w:spacing w:before="0" w:after="45" w:line="280" w:lineRule="exact"/>
+              <w:snapToGrid w:val="0"/>
+              <w:widowControl/>
+              <w:keepNext w:val="0"/>
+              <w:ind w:left="360" w:hanging="360"/>
+              <w:keepLines w:val="1"/>
+            </w:pPr>
+            <w:r>
+              <w:rPr>
+                <w:rFonts w:ascii="Times New Roman" w:hAnsi="Times New Roman" w:eastAsia="宋体" w:cs="Times New Roman"/>
+                <w:color w:val="000000"/>
+                <w:sz w:val="21"/>
+                <w:szCs w:val="21"/>
+              </w:rPr>
+              <w:t xml:space="preserve">[6] SPINU F. An Algorithm for Computing Risk Parity Weights[R]. SSRN, 2013. DOI 10.2139/ssrn.2297383.</w:t>
+            </w:r>
+          </w:p>
+          <w:p>
+            <w:pPr>
+              <w:jc w:val="left"/>
+              <w:spacing w:before="0" w:after="45" w:line="280" w:lineRule="exact"/>
+              <w:snapToGrid w:val="0"/>
+              <w:widowControl/>
+              <w:keepNext w:val="0"/>
+              <w:ind w:left="360" w:hanging="360"/>
+              <w:keepLines w:val="1"/>
+            </w:pPr>
+            <w:r>
+              <w:rPr>
+                <w:rFonts w:ascii="Times New Roman" w:hAnsi="Times New Roman" w:eastAsia="宋体" w:cs="Times New Roman"/>
+                <w:color w:val="000000"/>
+                <w:sz w:val="21"/>
+                <w:szCs w:val="21"/>
+              </w:rPr>
+              <w:t xml:space="preserve">[7] FENG Y, PALOMAR D P. SCRIP: Successive Convex Optimization Methods for Risk Parity Portfolio Design[J]. IEEE Transactions on Signal Processing, 2015, 63(19): 5285-5300.</w:t>
+            </w:r>
+          </w:p>
+          <w:p>
+            <w:pPr>
+              <w:jc w:val="left"/>
+              <w:spacing w:before="0" w:after="45" w:line="280" w:lineRule="exact"/>
+              <w:snapToGrid w:val="0"/>
+              <w:widowControl/>
+              <w:keepNext w:val="0"/>
+              <w:ind w:left="360" w:hanging="360"/>
+              <w:keepLines w:val="1"/>
+            </w:pPr>
+            <w:r>
+              <w:rPr>
+                <w:rFonts w:ascii="Times New Roman" w:hAnsi="Times New Roman" w:eastAsia="宋体" w:cs="Times New Roman"/>
+                <w:color w:val="000000"/>
+                <w:sz w:val="21"/>
+                <w:szCs w:val="21"/>
+              </w:rPr>
+              <w:t xml:space="preserve">[8] BOURGERON T, LEZMI E, RONCALLI T. Robust Asset Allocation for Robo-Advisors[R]. Paris: Amundi Asset Management, 2018.</w:t>
+            </w:r>
+          </w:p>
+          <w:p>
+            <w:pPr>
+              <w:jc w:val="left"/>
+              <w:spacing w:before="0" w:after="45" w:line="280" w:lineRule="exact"/>
+              <w:snapToGrid w:val="0"/>
+              <w:widowControl/>
+              <w:keepNext w:val="0"/>
+              <w:ind w:left="360" w:hanging="360"/>
+              <w:keepLines w:val="1"/>
+            </w:pPr>
+            <w:r>
+              <w:rPr>
+                <w:rFonts w:ascii="Times New Roman" w:hAnsi="Times New Roman" w:eastAsia="宋体" w:cs="Times New Roman"/>
+                <w:color w:val="000000"/>
+                <w:sz w:val="21"/>
+                <w:szCs w:val="21"/>
+              </w:rPr>
+              <w:t xml:space="preserve">[9] GAMBETA V, KWON R. Risk Return Trade-Off in Relaxed Risk Parity Portfolio Optimization[J]. Journal of Risk and Financial Management, 2020, 13(10): 237.</w:t>
+            </w:r>
+          </w:p>
+          <w:p>
+            <w:pPr>
+              <w:jc w:val="left"/>
+              <w:spacing w:before="0" w:after="45" w:line="280" w:lineRule="exact"/>
+              <w:snapToGrid w:val="0"/>
+              <w:widowControl/>
+              <w:keepNext w:val="0"/>
+              <w:ind w:left="360" w:hanging="360"/>
+              <w:keepLines w:val="1"/>
+            </w:pPr>
+            <w:r>
+              <w:rPr>
+                <w:rFonts w:ascii="Times New Roman" w:hAnsi="Times New Roman" w:eastAsia="宋体" w:cs="Times New Roman"/>
+                <w:color w:val="000000"/>
+                <w:sz w:val="21"/>
+                <w:szCs w:val="21"/>
+              </w:rPr>
+              <w:t xml:space="preserve">[10] NOCEDAL J, WRIGHT S J. Numerical Optimization[M]. 2nd ed. New York: Springer, 2006.</w:t>
+            </w:r>
+          </w:p>
+          <w:p>
+            <w:pPr>
+              <w:jc w:val="left"/>
+              <w:spacing w:before="0" w:after="45" w:line="280" w:lineRule="exact"/>
+              <w:snapToGrid w:val="0"/>
+              <w:widowControl/>
+              <w:keepNext w:val="0"/>
+              <w:ind w:left="360" w:hanging="360"/>
+              <w:keepLines w:val="1"/>
+            </w:pPr>
+            <w:r>
+              <w:rPr>
+                <w:rFonts w:ascii="Times New Roman" w:hAnsi="Times New Roman" w:eastAsia="宋体" w:cs="Times New Roman"/>
+                <w:color w:val="000000"/>
+                <w:sz w:val="21"/>
+                <w:szCs w:val="21"/>
+              </w:rPr>
+              <w:t xml:space="preserve">[11] BOYD S, BUSSETI E, DIAMOND S, et al. Multi-Period Trading via Convex Optimization[J]. Foundations and Trends in Optimization, 2017, 3(1): 1-76.</w:t>
+            </w:r>
+          </w:p>
+          <w:p>
+            <w:pPr>
+              <w:jc w:val="left"/>
+              <w:spacing w:before="0" w:after="45" w:line="280" w:lineRule="exact"/>
+              <w:snapToGrid w:val="0"/>
+              <w:widowControl/>
+              <w:keepNext w:val="0"/>
+              <w:ind w:left="360" w:hanging="360"/>
+              <w:keepLines w:val="1"/>
+            </w:pPr>
+            <w:r>
+              <w:rPr>
+                <w:rFonts w:ascii="Times New Roman" w:hAnsi="Times New Roman" w:eastAsia="宋体" w:cs="Times New Roman"/>
+                <w:color w:val="000000"/>
+                <w:sz w:val="21"/>
+                <w:szCs w:val="21"/>
+              </w:rPr>
+              <w:t xml:space="preserve">[12] SIEGMANN A, LUCAS A. Discrete-Time Financial Planning Models Under Loss-Averse Preferences[J]. Operations Research, 2005, 53(3): 403-414.</w:t>
+            </w:r>
+          </w:p>
+        </w:tc>
+      </w:tr>
+    </w:tbl>
+    <w:p>
+      <w:pPr>
+        <w:spacing w:before="0" w:after="0" w:line="20" w:lineRule="exact"/>
+      </w:pPr>
+      <w:r>
+        <w:br w:type="page"/>
+      </w:r>
+    </w:p>
+    <w:tbl>
+      <w:tblPr>
+        <w:tblStyle w:val="5"/>
+        <w:tblW w:w="8436" w:type="dxa"/>
+        <w:tblInd w:w="0" w:type="dxa"/>
+        <w:tblBorders>
+          <w:top w:val="single" w:color="auto" w:sz="4" w:space="0"/>
+          <w:left w:val="single" w:color="auto" w:sz="4" w:space="0"/>
+          <w:bottom w:val="single" w:color="auto" w:sz="4" w:space="0"/>
+          <w:right w:val="single" w:color="auto" w:sz="4" w:space="0"/>
+          <w:insideH w:val="single" w:color="auto" w:sz="4" w:space="0"/>
+          <w:insideV w:val="single" w:color="auto" w:sz="4" w:space="0"/>
+        </w:tblBorders>
+        <w:tblLayout w:type="fixed"/>
+        <w:tblCellMar>
+          <w:top w:w="0" w:type="dxa"/>
+          <w:left w:w="108" w:type="dxa"/>
+          <w:bottom w:w="0" w:type="dxa"/>
+          <w:right w:w="108" w:type="dxa"/>
+        </w:tblCellMar>
+      </w:tblPr>
+      <w:tblGrid>
+        <w:gridCol w:w="2263"/>
+        <w:gridCol w:w="2273"/>
+        <w:gridCol w:w="2275"/>
+        <w:gridCol w:w="1625"/>
+      </w:tblGrid>
+      <w:tr>
+        <w:tblPrEx>
+          <w:tblBorders>
+            <w:top w:val="single" w:color="auto" w:sz="4" w:space="0"/>
+            <w:left w:val="single" w:color="auto" w:sz="4" w:space="0"/>
+            <w:bottom w:val="single" w:color="auto" w:sz="4" w:space="0"/>
+            <w:right w:val="single" w:color="auto" w:sz="4" w:space="0"/>
+            <w:insideH w:val="single" w:color="auto" w:sz="4" w:space="0"/>
+            <w:insideV w:val="single" w:color="auto" w:sz="4" w:space="0"/>
+          </w:tblBorders>
+          <w:tblCellMar>
+            <w:top w:w="0" w:type="dxa"/>
+            <w:left w:w="108" w:type="dxa"/>
+            <w:bottom w:w="0" w:type="dxa"/>
+            <w:right w:w="108" w:type="dxa"/>
+          </w:tblCellMar>
+        </w:tblPrEx>
+        <w:trPr>
+          <w:cantSplit w:val="0"/>
+        </w:trPr>
+        <w:tc>
+          <w:tcPr>
+            <w:tcW w:w="8436" w:type="dxa"/>
+            <w:gridSpan w:val="4"/>
+            <w:tcMar>
+              <w:left w:w="120" w:type="dxa"/>
+              <w:right w:w="120" w:type="dxa"/>
+              <w:top w:w="70" w:type="dxa"/>
+              <w:bottom w:w="70" w:type="dxa"/>
+            </w:tcMar>
+          </w:tcPr>
+          <w:p>
+            <w:pPr>
+              <w:jc w:val="left"/>
+              <w:spacing w:before="80" w:after="60" w:line="320" w:lineRule="exact"/>
+              <w:snapToGrid w:val="0"/>
+              <w:widowControl/>
+              <w:keepNext w:val="0"/>
+              <w:keepLines/>
+            </w:pPr>
+            <w:r>
+              <w:rPr>
+                <w:rFonts w:ascii="Times New Roman" w:hAnsi="Times New Roman" w:eastAsia="仿宋" w:cs="Times New Roman"/>
+                <w:color w:val="000000"/>
+                <w:sz w:val="24"/>
+                <w:szCs w:val="24"/>
+                <w:b/>
+              </w:rPr>
               <w:t xml:space="preserve">三、主要研究内容</w:t>
             </w:r>
           </w:p>
           <w:p>
             <w:pPr>
               <w:jc w:val="left"/>
-              <w:spacing w:before="100" w:after="80" w:line="360" w:lineRule="exact"/>
+              <w:spacing w:before="80" w:after="60" w:line="320" w:lineRule="exact"/>
               <w:snapToGrid w:val="0"/>
               <w:widowControl/>
               <w:keepNext w:val="0"/>
@@ -1146,7 +1311,7 @@
           <w:p>
             <w:pPr>
               <w:jc w:val="both"/>
-              <w:spacing w:before="0" w:after="65" w:line="360" w:lineRule="exact"/>
+              <w:spacing w:before="0" w:after="45" w:line="320" w:lineRule="exact"/>
               <w:snapToGrid w:val="0"/>
               <w:widowControl/>
               <w:keepNext w:val="0"/>
@@ -1165,7 +1330,7 @@
           <w:p>
             <w:pPr>
               <w:jc w:val="center"/>
-              <w:spacing w:before="0" w:after="65" w:line="300" w:lineRule="atLeast"/>
+              <w:spacing w:before="100" w:after="100" w:line="300" w:lineRule="atLeast"/>
               <w:snapToGrid w:val="0"/>
               <w:widowControl/>
               <w:keepNext w:val="0"/>
@@ -1217,7 +1382,7 @@
           <w:p>
             <w:pPr>
               <w:jc w:val="both"/>
-              <w:spacing w:before="0" w:after="65" w:line="360" w:lineRule="exact"/>
+              <w:spacing w:before="0" w:after="45" w:line="320" w:lineRule="exact"/>
               <w:snapToGrid w:val="0"/>
               <w:widowControl/>
               <w:keepNext w:val="0"/>
@@ -1236,7 +1401,7 @@
           <w:p>
             <w:pPr>
               <w:jc w:val="left"/>
-              <w:spacing w:before="100" w:after="80" w:line="360" w:lineRule="exact"/>
+              <w:spacing w:before="80" w:after="60" w:line="320" w:lineRule="exact"/>
               <w:snapToGrid w:val="0"/>
               <w:widowControl/>
               <w:keepNext w:val="0"/>
@@ -1256,7 +1421,7 @@
           <w:p>
             <w:pPr>
               <w:jc w:val="both"/>
-              <w:spacing w:before="0" w:after="65" w:line="360" w:lineRule="exact"/>
+              <w:spacing w:before="0" w:after="45" w:line="320" w:lineRule="exact"/>
               <w:snapToGrid w:val="0"/>
               <w:widowControl/>
               <w:keepNext w:val="0"/>
@@ -1275,7 +1440,7 @@
           <w:p>
             <w:pPr>
               <w:jc w:val="left"/>
-              <w:spacing w:before="100" w:after="80" w:line="360" w:lineRule="exact"/>
+              <w:spacing w:before="80" w:after="60" w:line="320" w:lineRule="exact"/>
               <w:snapToGrid w:val="0"/>
               <w:widowControl/>
               <w:keepNext w:val="0"/>
@@ -1295,7 +1460,7 @@
           <w:p>
             <w:pPr>
               <w:jc w:val="both"/>
-              <w:spacing w:before="0" w:after="65" w:line="360" w:lineRule="exact"/>
+              <w:spacing w:before="0" w:after="45" w:line="320" w:lineRule="exact"/>
               <w:snapToGrid w:val="0"/>
               <w:widowControl/>
               <w:keepNext w:val="0"/>
@@ -1313,6 +1478,42 @@
           </w:p>
         </w:tc>
       </w:tr>
+    </w:tbl>
+    <w:p>
+      <w:pPr>
+        <w:spacing w:before="0" w:after="0" w:line="20" w:lineRule="exact"/>
+      </w:pPr>
+      <w:r>
+        <w:br w:type="page"/>
+      </w:r>
+    </w:p>
+    <w:tbl>
+      <w:tblPr>
+        <w:tblStyle w:val="5"/>
+        <w:tblW w:w="8436" w:type="dxa"/>
+        <w:tblInd w:w="0" w:type="dxa"/>
+        <w:tblBorders>
+          <w:top w:val="single" w:color="auto" w:sz="4" w:space="0"/>
+          <w:left w:val="single" w:color="auto" w:sz="4" w:space="0"/>
+          <w:bottom w:val="single" w:color="auto" w:sz="4" w:space="0"/>
+          <w:right w:val="single" w:color="auto" w:sz="4" w:space="0"/>
+          <w:insideH w:val="single" w:color="auto" w:sz="4" w:space="0"/>
+          <w:insideV w:val="single" w:color="auto" w:sz="4" w:space="0"/>
+        </w:tblBorders>
+        <w:tblLayout w:type="fixed"/>
+        <w:tblCellMar>
+          <w:top w:w="0" w:type="dxa"/>
+          <w:left w:w="108" w:type="dxa"/>
+          <w:bottom w:w="0" w:type="dxa"/>
+          <w:right w:w="108" w:type="dxa"/>
+        </w:tblCellMar>
+      </w:tblPr>
+      <w:tblGrid>
+        <w:gridCol w:w="2263"/>
+        <w:gridCol w:w="2273"/>
+        <w:gridCol w:w="2275"/>
+        <w:gridCol w:w="1625"/>
+      </w:tblGrid>
       <w:tr>
         <w:tblPrEx>
           <w:tblBorders>
@@ -1337,11 +1538,17 @@
           <w:tcPr>
             <w:tcW w:w="8436" w:type="dxa"/>
             <w:gridSpan w:val="4"/>
+            <w:tcMar>
+              <w:left w:w="120" w:type="dxa"/>
+              <w:right w:w="120" w:type="dxa"/>
+              <w:top w:w="70" w:type="dxa"/>
+              <w:bottom w:w="70" w:type="dxa"/>
+            </w:tcMar>
           </w:tcPr>
           <w:p>
             <w:pPr>
               <w:jc w:val="left"/>
-              <w:spacing w:before="100" w:after="80" w:line="360" w:lineRule="exact"/>
+              <w:spacing w:before="80" w:after="60" w:line="320" w:lineRule="exact"/>
               <w:snapToGrid w:val="0"/>
               <w:widowControl/>
               <w:keepNext w:val="0"/>
@@ -1361,7 +1568,7 @@
           <w:p>
             <w:pPr>
               <w:jc w:val="left"/>
-              <w:spacing w:before="100" w:after="80" w:line="360" w:lineRule="exact"/>
+              <w:spacing w:before="80" w:after="60" w:line="320" w:lineRule="exact"/>
               <w:snapToGrid w:val="0"/>
               <w:widowControl/>
               <w:keepNext w:val="0"/>
@@ -1381,7 +1588,7 @@
           <w:p>
             <w:pPr>
               <w:jc w:val="both"/>
-              <w:spacing w:before="0" w:after="65" w:line="360" w:lineRule="exact"/>
+              <w:spacing w:before="0" w:after="45" w:line="320" w:lineRule="exact"/>
               <w:snapToGrid w:val="0"/>
               <w:widowControl/>
               <w:keepNext w:val="0"/>
@@ -1400,7 +1607,7 @@
           <w:p>
             <w:pPr>
               <w:jc w:val="left"/>
-              <w:spacing w:before="100" w:after="80" w:line="360" w:lineRule="exact"/>
+              <w:spacing w:before="80" w:after="60" w:line="320" w:lineRule="exact"/>
               <w:snapToGrid w:val="0"/>
               <w:widowControl/>
               <w:keepNext w:val="0"/>
@@ -1420,7 +1627,7 @@
           <w:p>
             <w:pPr>
               <w:jc w:val="both"/>
-              <w:spacing w:before="0" w:after="65" w:line="360" w:lineRule="exact"/>
+              <w:spacing w:before="0" w:after="45" w:line="320" w:lineRule="exact"/>
               <w:snapToGrid w:val="0"/>
               <w:widowControl/>
               <w:keepNext w:val="0"/>
@@ -1439,7 +1646,7 @@
           <w:p>
             <w:pPr>
               <w:jc w:val="both"/>
-              <w:spacing w:before="0" w:after="65" w:line="360" w:lineRule="exact"/>
+              <w:spacing w:before="0" w:after="45" w:line="320" w:lineRule="exact"/>
               <w:snapToGrid w:val="0"/>
               <w:widowControl/>
               <w:keepNext w:val="0"/>
@@ -1458,7 +1665,7 @@
           <w:p>
             <w:pPr>
               <w:jc w:val="left"/>
-              <w:spacing w:before="100" w:after="80" w:line="360" w:lineRule="exact"/>
+              <w:spacing w:before="80" w:after="60" w:line="320" w:lineRule="exact"/>
               <w:snapToGrid w:val="0"/>
               <w:widowControl/>
               <w:keepNext w:val="0"/>
@@ -1478,7 +1685,7 @@
           <w:p>
             <w:pPr>
               <w:jc w:val="both"/>
-              <w:spacing w:before="0" w:after="65" w:line="360" w:lineRule="exact"/>
+              <w:spacing w:before="0" w:after="45" w:line="320" w:lineRule="exact"/>
               <w:snapToGrid w:val="0"/>
               <w:widowControl/>
               <w:keepNext w:val="0"/>
@@ -1497,7 +1704,7 @@
           <w:p>
             <w:pPr>
               <w:jc w:val="both"/>
-              <w:spacing w:before="0" w:after="65" w:line="360" w:lineRule="exact"/>
+              <w:spacing w:before="0" w:after="45" w:line="320" w:lineRule="exact"/>
               <w:snapToGrid w:val="0"/>
               <w:widowControl/>
               <w:keepNext w:val="0"/>
@@ -1516,7 +1723,7 @@
           <w:p>
             <w:pPr>
               <w:jc w:val="left"/>
-              <w:spacing w:before="100" w:after="80" w:line="360" w:lineRule="exact"/>
+              <w:spacing w:before="80" w:after="60" w:line="320" w:lineRule="exact"/>
               <w:snapToGrid w:val="0"/>
               <w:widowControl/>
               <w:keepNext w:val="0"/>
@@ -1536,7 +1743,7 @@
           <w:p>
             <w:pPr>
               <w:jc w:val="both"/>
-              <w:spacing w:before="0" w:after="65" w:line="360" w:lineRule="exact"/>
+              <w:spacing w:before="0" w:after="45" w:line="320" w:lineRule="exact"/>
               <w:snapToGrid w:val="0"/>
               <w:widowControl/>
               <w:keepNext w:val="0"/>
@@ -1554,6 +1761,42 @@
           </w:p>
         </w:tc>
       </w:tr>
+    </w:tbl>
+    <w:p>
+      <w:pPr>
+        <w:spacing w:before="0" w:after="0" w:line="20" w:lineRule="exact"/>
+      </w:pPr>
+      <w:r>
+        <w:br w:type="page"/>
+      </w:r>
+    </w:p>
+    <w:tbl>
+      <w:tblPr>
+        <w:tblStyle w:val="5"/>
+        <w:tblW w:w="8436" w:type="dxa"/>
+        <w:tblInd w:w="0" w:type="dxa"/>
+        <w:tblBorders>
+          <w:top w:val="single" w:color="auto" w:sz="4" w:space="0"/>
+          <w:left w:val="single" w:color="auto" w:sz="4" w:space="0"/>
+          <w:bottom w:val="single" w:color="auto" w:sz="4" w:space="0"/>
+          <w:right w:val="single" w:color="auto" w:sz="4" w:space="0"/>
+          <w:insideH w:val="single" w:color="auto" w:sz="4" w:space="0"/>
+          <w:insideV w:val="single" w:color="auto" w:sz="4" w:space="0"/>
+        </w:tblBorders>
+        <w:tblLayout w:type="fixed"/>
+        <w:tblCellMar>
+          <w:top w:w="0" w:type="dxa"/>
+          <w:left w:w="108" w:type="dxa"/>
+          <w:bottom w:w="0" w:type="dxa"/>
+          <w:right w:w="108" w:type="dxa"/>
+        </w:tblCellMar>
+      </w:tblPr>
+      <w:tblGrid>
+        <w:gridCol w:w="2263"/>
+        <w:gridCol w:w="2273"/>
+        <w:gridCol w:w="2275"/>
+        <w:gridCol w:w="1625"/>
+      </w:tblGrid>
       <w:tr>
         <w:tblPrEx>
           <w:tblBorders>
@@ -1578,11 +1821,17 @@
           <w:tcPr>
             <w:tcW w:w="8436" w:type="dxa"/>
             <w:gridSpan w:val="4"/>
+            <w:tcMar>
+              <w:left w:w="120" w:type="dxa"/>
+              <w:right w:w="120" w:type="dxa"/>
+              <w:top w:w="70" w:type="dxa"/>
+              <w:bottom w:w="70" w:type="dxa"/>
+            </w:tcMar>
           </w:tcPr>
           <w:p>
             <w:pPr>
               <w:jc w:val="left"/>
-              <w:spacing w:before="100" w:after="80" w:line="360" w:lineRule="exact"/>
+              <w:spacing w:before="80" w:after="60" w:line="320" w:lineRule="exact"/>
               <w:snapToGrid w:val="0"/>
               <w:widowControl/>
               <w:keepNext w:val="0"/>
@@ -1602,7 +1851,7 @@
           <w:p>
             <w:pPr>
               <w:jc w:val="both"/>
-              <w:spacing w:before="0" w:after="65" w:line="360" w:lineRule="exact"/>
+              <w:spacing w:before="0" w:after="45" w:line="320" w:lineRule="exact"/>
               <w:snapToGrid w:val="0"/>
               <w:widowControl/>
               <w:keepNext w:val="0"/>
@@ -1621,7 +1870,7 @@
           <w:p>
             <w:pPr>
               <w:jc w:val="left"/>
-              <w:spacing w:before="100" w:after="80" w:line="360" w:lineRule="exact"/>
+              <w:spacing w:before="80" w:after="60" w:line="320" w:lineRule="exact"/>
               <w:snapToGrid w:val="0"/>
               <w:widowControl/>
               <w:keepNext w:val="0"/>
@@ -1641,7 +1890,7 @@
           <w:p>
             <w:pPr>
               <w:jc w:val="both"/>
-              <w:spacing w:before="0" w:after="65" w:line="360" w:lineRule="exact"/>
+              <w:spacing w:before="0" w:after="45" w:line="320" w:lineRule="exact"/>
               <w:snapToGrid w:val="0"/>
               <w:widowControl/>
               <w:keepNext w:val="0"/>
@@ -1660,7 +1909,7 @@
           <w:p>
             <w:pPr>
               <w:jc w:val="left"/>
-              <w:spacing w:before="100" w:after="80" w:line="360" w:lineRule="exact"/>
+              <w:spacing w:before="80" w:after="60" w:line="320" w:lineRule="exact"/>
               <w:snapToGrid w:val="0"/>
               <w:widowControl/>
               <w:keepNext w:val="0"/>
@@ -1680,7 +1929,7 @@
           <w:p>
             <w:pPr>
               <w:jc w:val="both"/>
-              <w:spacing w:before="0" w:after="65" w:line="360" w:lineRule="exact"/>
+              <w:spacing w:before="0" w:after="45" w:line="320" w:lineRule="exact"/>
               <w:snapToGrid w:val="0"/>
               <w:widowControl/>
               <w:keepNext w:val="0"/>
@@ -1699,7 +1948,7 @@
           <w:p>
             <w:pPr>
               <w:jc w:val="left"/>
-              <w:spacing w:before="100" w:after="80" w:line="360" w:lineRule="exact"/>
+              <w:spacing w:before="80" w:after="60" w:line="320" w:lineRule="exact"/>
               <w:snapToGrid w:val="0"/>
               <w:widowControl/>
               <w:keepNext w:val="0"/>
@@ -1719,7 +1968,7 @@
           <w:p>
             <w:pPr>
               <w:jc w:val="both"/>
-              <w:spacing w:before="0" w:after="65" w:line="360" w:lineRule="exact"/>
+              <w:spacing w:before="0" w:after="45" w:line="320" w:lineRule="exact"/>
               <w:snapToGrid w:val="0"/>
               <w:widowControl/>
               <w:keepNext w:val="0"/>
@@ -1738,7 +1987,7 @@
           <w:p>
             <w:pPr>
               <w:jc w:val="left"/>
-              <w:spacing w:before="100" w:after="80" w:line="360" w:lineRule="exact"/>
+              <w:spacing w:before="80" w:after="60" w:line="320" w:lineRule="exact"/>
               <w:snapToGrid w:val="0"/>
               <w:widowControl/>
               <w:keepNext w:val="0"/>
@@ -1758,7 +2007,7 @@
           <w:p>
             <w:pPr>
               <w:jc w:val="both"/>
-              <w:spacing w:before="0" w:after="65" w:line="360" w:lineRule="exact"/>
+              <w:spacing w:before="0" w:after="45" w:line="320" w:lineRule="exact"/>
               <w:snapToGrid w:val="0"/>
               <w:widowControl/>
               <w:keepNext w:val="0"/>
@@ -1777,7 +2026,7 @@
           <w:p>
             <w:pPr>
               <w:jc w:val="left"/>
-              <w:spacing w:before="100" w:after="80" w:line="360" w:lineRule="exact"/>
+              <w:spacing w:before="80" w:after="60" w:line="320" w:lineRule="exact"/>
               <w:snapToGrid w:val="0"/>
               <w:widowControl/>
               <w:keepNext w:val="0"/>
@@ -1797,7 +2046,7 @@
           <w:p>
             <w:pPr>
               <w:jc w:val="both"/>
-              <w:spacing w:before="0" w:after="65" w:line="360" w:lineRule="exact"/>
+              <w:spacing w:before="0" w:after="45" w:line="320" w:lineRule="exact"/>
               <w:snapToGrid w:val="0"/>
               <w:widowControl/>
               <w:keepNext w:val="0"/>
@@ -1839,11 +2088,17 @@
           <w:tcPr>
             <w:tcW w:w="8436" w:type="dxa"/>
             <w:gridSpan w:val="4"/>
+            <w:tcMar>
+              <w:left w:w="120" w:type="dxa"/>
+              <w:right w:w="120" w:type="dxa"/>
+              <w:top w:w="70" w:type="dxa"/>
+              <w:bottom w:w="70" w:type="dxa"/>
+            </w:tcMar>
           </w:tcPr>
           <w:p>
             <w:pPr>
               <w:jc w:val="left"/>
-              <w:spacing w:before="100" w:after="80" w:line="360" w:lineRule="exact"/>
+              <w:spacing w:before="80" w:after="60" w:line="320" w:lineRule="exact"/>
               <w:snapToGrid w:val="0"/>
               <w:widowControl/>
               <w:keepNext w:val="0"/>
@@ -1863,7 +2118,7 @@
           <w:p>
             <w:pPr>
               <w:jc w:val="both"/>
-              <w:spacing w:before="0" w:after="1600" w:line="360" w:lineRule="exact"/>
+              <w:spacing w:before="0" w:after="1600" w:line="320" w:lineRule="exact"/>
               <w:snapToGrid w:val="0"/>
               <w:widowControl/>
               <w:keepNext w:val="0"/>
@@ -1882,7 +2137,7 @@
           <w:p>
             <w:pPr>
               <w:jc w:val="both"/>
-              <w:spacing w:before="0" w:after="65" w:line="360" w:lineRule="exact"/>
+              <w:spacing w:before="0" w:after="45" w:line="320" w:lineRule="exact"/>
               <w:snapToGrid w:val="0"/>
               <w:widowControl/>
               <w:keepNext w:val="0"/>

</xml_diff>

<commit_message>
docs: remove bracketed citation numbers from proposal
</commit_message>
<xml_diff>
--- a/report/proposal_outline/许哲圣_本科毕业论文开题报告.docx
+++ b/report/proposal_outline/许哲圣_本科毕业论文开题报告.docx
@@ -1,6 +1,6 @@
 
 <file path=word/document.xml><?xml version="1.0" encoding="utf-8"?>
-<w:document xmlns:wpc="http://schemas.microsoft.com/office/word/2010/wordprocessingCanvas" xmlns:mc="http://schemas.openxmlformats.org/markup-compatibility/2006" xmlns:o="urn:schemas-microsoft-com:office:office" xmlns:r="http://schemas.openxmlformats.org/officeDocument/2006/relationships" xmlns:m="http://schemas.openxmlformats.org/officeDocument/2006/math" xmlns:v="urn:schemas-microsoft-com:vml" xmlns:wp14="http://schemas.microsoft.com/office/word/2010/wordprocessingDrawing" xmlns:wp="http://schemas.openxmlformats.org/drawingml/2006/wordprocessingDrawing" xmlns:w="http://schemas.openxmlformats.org/wordprocessingml/2006/main" xmlns:w14="http://schemas.microsoft.com/office/word/2010/wordml" xmlns:w10="urn:schemas-microsoft-com:office:word" xmlns:w15="http://schemas.microsoft.com/office/word/2012/wordml" xmlns:wpg="http://schemas.microsoft.com/office/word/2010/wordprocessingGroup" xmlns:wpi="http://schemas.microsoft.com/office/word/2010/wordprocessingInk" xmlns:wne="http://schemas.microsoft.com/office/word/2006/wordml" xmlns:wps="http://schemas.microsoft.com/office/word/2010/wordprocessingShape" xmlns:wpsCustomData="http://www.wps.cn/officeDocument/2013/wpsCustomData" mc:Ignorable="w14 w15 wp14">
+<w:document xmlns:wpc="http://schemas.microsoft.com/office/word/2010/wordprocessingCanvas" xmlns:cx="http://schemas.microsoft.com/office/drawing/2014/chartex" xmlns:cx1="http://schemas.microsoft.com/office/drawing/2015/9/8/chartex" xmlns:cx2="http://schemas.microsoft.com/office/drawing/2015/10/21/chartex" xmlns:cx3="http://schemas.microsoft.com/office/drawing/2016/5/9/chartex" xmlns:cx4="http://schemas.microsoft.com/office/drawing/2016/5/10/chartex" xmlns:cx5="http://schemas.microsoft.com/office/drawing/2016/5/11/chartex" xmlns:cx6="http://schemas.microsoft.com/office/drawing/2016/5/12/chartex" xmlns:cx7="http://schemas.microsoft.com/office/drawing/2016/5/13/chartex" xmlns:cx8="http://schemas.microsoft.com/office/drawing/2016/5/14/chartex" xmlns:mc="http://schemas.openxmlformats.org/markup-compatibility/2006" xmlns:o="urn:schemas-microsoft-com:office:office" xmlns:r="http://schemas.openxmlformats.org/officeDocument/2006/relationships" xmlns:m="http://schemas.openxmlformats.org/officeDocument/2006/math" xmlns:v="urn:schemas-microsoft-com:vml" xmlns:wp14="http://schemas.microsoft.com/office/word/2010/wordprocessingDrawing" xmlns:wp="http://schemas.openxmlformats.org/drawingml/2006/wordprocessingDrawing" xmlns:w="http://schemas.openxmlformats.org/wordprocessingml/2006/main" xmlns:w14="http://schemas.microsoft.com/office/word/2010/wordml" xmlns:w10="urn:schemas-microsoft-com:office:word" xmlns:w15="http://schemas.microsoft.com/office/word/2012/wordml" xmlns:wpg="http://schemas.microsoft.com/office/word/2010/wordprocessingGroup" xmlns:wpi="http://schemas.microsoft.com/office/word/2010/wordprocessingInk" xmlns:wne="http://schemas.microsoft.com/office/word/2006/wordml" xmlns:wps="http://schemas.microsoft.com/office/word/2010/wordprocessingShape" xmlns:wpsCustomData="http://www.wps.cn/officeDocument/2013/wpsCustomData" mc:Ignorable="w14 w15 wp14">
   <w:body>
     <w:p>
       <w:pPr>
@@ -111,22 +111,22 @@
     </w:p>
     <w:p>
       <w:pPr>
-        <w:ind w:left="600"/>
-        <w:snapToGrid w:val="0"/>
-        <w:spacing w:before="100" w:after="180" w:line="440" w:lineRule="exact"/>
         <w:tabs>
           <w:tab w:val="left" w:pos="2300"/>
         </w:tabs>
+        <w:snapToGrid w:val="0"/>
+        <w:spacing w:before="100" w:after="180" w:line="440" w:lineRule="exact"/>
+        <w:ind w:left="600"/>
       </w:pPr>
       <w:r>
         <w:rPr>
           <w:rFonts w:ascii="Times New Roman" w:hAnsi="Times New Roman" w:eastAsia="宋体" w:cs="Times New Roman"/>
+          <w:b/>
           <w:color w:val="000000"/>
           <w:sz w:val="30"/>
           <w:szCs w:val="30"/>
-          <w:b/>
         </w:rPr>
-        <w:t xml:space="preserve">题    目</w:t>
+        <w:t>题    目</w:t>
       </w:r>
       <w:r>
         <w:tab/>
@@ -134,25 +134,32 @@
       <w:r>
         <w:rPr>
           <w:rFonts w:ascii="Times New Roman" w:hAnsi="Times New Roman" w:eastAsia="宋体" w:cs="Times New Roman"/>
+          <w:b/>
           <w:color w:val="000000"/>
           <w:sz w:val="30"/>
           <w:szCs w:val="30"/>
-          <w:b/>
         </w:rPr>
-        <w:t xml:space="preserve">基于宽松风险平价的</w:t>
-      </w:r>
-      <w:r>
-        <w:br/>
-      </w:r>
+        <w:t>基于宽松风险平价的多资产 ETF 配置研究</w:t>
+      </w:r>
+    </w:p>
+    <w:p>
+      <w:pPr>
+        <w:tabs>
+          <w:tab w:val="left" w:pos="2300"/>
+        </w:tabs>
+        <w:snapToGrid w:val="0"/>
+        <w:spacing w:before="100" w:after="180" w:line="440" w:lineRule="exact"/>
+        <w:ind w:left="600"/>
+      </w:pPr>
       <w:r>
         <w:rPr>
           <w:rFonts w:ascii="Times New Roman" w:hAnsi="Times New Roman" w:eastAsia="宋体" w:cs="Times New Roman"/>
+          <w:b/>
           <w:color w:val="000000"/>
           <w:sz w:val="30"/>
           <w:szCs w:val="30"/>
-          <w:b/>
         </w:rPr>
-        <w:t xml:space="preserve"/>
+        <w:t>学    院</w:t>
       </w:r>
       <w:r>
         <w:tab/>
@@ -160,32 +167,32 @@
       <w:r>
         <w:rPr>
           <w:rFonts w:ascii="Times New Roman" w:hAnsi="Times New Roman" w:eastAsia="宋体" w:cs="Times New Roman"/>
+          <w:b/>
           <w:color w:val="000000"/>
           <w:sz w:val="30"/>
           <w:szCs w:val="30"/>
-          <w:b/>
         </w:rPr>
-        <w:t xml:space="preserve">多资产 ETF 配置研究</w:t>
+        <w:t>特拉华数据科学学院</w:t>
       </w:r>
     </w:p>
     <w:p>
       <w:pPr>
-        <w:ind w:left="600"/>
-        <w:snapToGrid w:val="0"/>
-        <w:spacing w:before="100" w:after="180" w:line="440" w:lineRule="exact"/>
         <w:tabs>
           <w:tab w:val="left" w:pos="2300"/>
         </w:tabs>
+        <w:snapToGrid w:val="0"/>
+        <w:spacing w:before="100" w:after="180" w:line="440" w:lineRule="exact"/>
+        <w:ind w:left="600"/>
       </w:pPr>
       <w:r>
         <w:rPr>
           <w:rFonts w:ascii="Times New Roman" w:hAnsi="Times New Roman" w:eastAsia="宋体" w:cs="Times New Roman"/>
+          <w:b/>
           <w:color w:val="000000"/>
           <w:sz w:val="30"/>
           <w:szCs w:val="30"/>
-          <w:b/>
         </w:rPr>
-        <w:t xml:space="preserve">学    院</w:t>
+        <w:t>专    业</w:t>
       </w:r>
       <w:r>
         <w:tab/>
@@ -193,32 +200,32 @@
       <w:r>
         <w:rPr>
           <w:rFonts w:ascii="Times New Roman" w:hAnsi="Times New Roman" w:eastAsia="宋体" w:cs="Times New Roman"/>
+          <w:b/>
           <w:color w:val="000000"/>
           <w:sz w:val="30"/>
           <w:szCs w:val="30"/>
-          <w:b/>
         </w:rPr>
-        <w:t xml:space="preserve">特拉华数据科学学院</w:t>
+        <w:t>金融数学</w:t>
       </w:r>
     </w:p>
     <w:p>
       <w:pPr>
-        <w:ind w:left="600"/>
-        <w:snapToGrid w:val="0"/>
-        <w:spacing w:before="100" w:after="180" w:line="440" w:lineRule="exact"/>
         <w:tabs>
           <w:tab w:val="left" w:pos="2300"/>
         </w:tabs>
+        <w:snapToGrid w:val="0"/>
+        <w:spacing w:before="100" w:after="180" w:line="440" w:lineRule="exact"/>
+        <w:ind w:left="600"/>
       </w:pPr>
       <w:r>
         <w:rPr>
           <w:rFonts w:ascii="Times New Roman" w:hAnsi="Times New Roman" w:eastAsia="宋体" w:cs="Times New Roman"/>
+          <w:b/>
           <w:color w:val="000000"/>
           <w:sz w:val="30"/>
           <w:szCs w:val="30"/>
-          <w:b/>
         </w:rPr>
-        <w:t xml:space="preserve">专    业</w:t>
+        <w:t>年    级</w:t>
       </w:r>
       <w:r>
         <w:tab/>
@@ -226,32 +233,32 @@
       <w:r>
         <w:rPr>
           <w:rFonts w:ascii="Times New Roman" w:hAnsi="Times New Roman" w:eastAsia="宋体" w:cs="Times New Roman"/>
+          <w:b/>
           <w:color w:val="000000"/>
           <w:sz w:val="30"/>
           <w:szCs w:val="30"/>
-          <w:b/>
         </w:rPr>
-        <w:t xml:space="preserve">金融数学</w:t>
+        <w:t>2023级</w:t>
       </w:r>
     </w:p>
     <w:p>
       <w:pPr>
-        <w:ind w:left="600"/>
-        <w:snapToGrid w:val="0"/>
-        <w:spacing w:before="100" w:after="180" w:line="440" w:lineRule="exact"/>
         <w:tabs>
           <w:tab w:val="left" w:pos="2300"/>
         </w:tabs>
+        <w:snapToGrid w:val="0"/>
+        <w:spacing w:before="100" w:after="180" w:line="440" w:lineRule="exact"/>
+        <w:ind w:left="600"/>
       </w:pPr>
       <w:r>
         <w:rPr>
           <w:rFonts w:ascii="Times New Roman" w:hAnsi="Times New Roman" w:eastAsia="宋体" w:cs="Times New Roman"/>
+          <w:b/>
           <w:color w:val="000000"/>
           <w:sz w:val="30"/>
           <w:szCs w:val="30"/>
-          <w:b/>
         </w:rPr>
-        <w:t xml:space="preserve">年    级</w:t>
+        <w:t>学生姓名</w:t>
       </w:r>
       <w:r>
         <w:tab/>
@@ -259,32 +266,32 @@
       <w:r>
         <w:rPr>
           <w:rFonts w:ascii="Times New Roman" w:hAnsi="Times New Roman" w:eastAsia="宋体" w:cs="Times New Roman"/>
+          <w:b/>
           <w:color w:val="000000"/>
           <w:sz w:val="30"/>
           <w:szCs w:val="30"/>
-          <w:b/>
         </w:rPr>
-        <w:t xml:space="preserve">2023级</w:t>
+        <w:t>许哲圣</w:t>
       </w:r>
     </w:p>
     <w:p>
       <w:pPr>
-        <w:ind w:left="600"/>
-        <w:snapToGrid w:val="0"/>
-        <w:spacing w:before="100" w:after="180" w:line="440" w:lineRule="exact"/>
         <w:tabs>
           <w:tab w:val="left" w:pos="2300"/>
         </w:tabs>
+        <w:snapToGrid w:val="0"/>
+        <w:spacing w:before="100" w:after="180" w:line="440" w:lineRule="exact"/>
+        <w:ind w:left="600"/>
       </w:pPr>
       <w:r>
         <w:rPr>
           <w:rFonts w:ascii="Times New Roman" w:hAnsi="Times New Roman" w:eastAsia="宋体" w:cs="Times New Roman"/>
+          <w:b/>
           <w:color w:val="000000"/>
           <w:sz w:val="30"/>
           <w:szCs w:val="30"/>
-          <w:b/>
         </w:rPr>
-        <w:t xml:space="preserve">学生姓名</w:t>
+        <w:t>学    号</w:t>
       </w:r>
       <w:r>
         <w:tab/>
@@ -292,32 +299,32 @@
       <w:r>
         <w:rPr>
           <w:rFonts w:ascii="Times New Roman" w:hAnsi="Times New Roman" w:eastAsia="宋体" w:cs="Times New Roman"/>
+          <w:b/>
           <w:color w:val="000000"/>
           <w:sz w:val="30"/>
           <w:szCs w:val="30"/>
-          <w:b/>
         </w:rPr>
-        <w:t xml:space="preserve">许哲圣</w:t>
+        <w:t>42353012</w:t>
       </w:r>
     </w:p>
     <w:p>
       <w:pPr>
-        <w:ind w:left="600"/>
-        <w:snapToGrid w:val="0"/>
-        <w:spacing w:before="100" w:after="180" w:line="440" w:lineRule="exact"/>
         <w:tabs>
           <w:tab w:val="left" w:pos="2300"/>
         </w:tabs>
+        <w:snapToGrid w:val="0"/>
+        <w:spacing w:before="100" w:after="180" w:line="440" w:lineRule="exact"/>
+        <w:ind w:left="600"/>
       </w:pPr>
       <w:r>
         <w:rPr>
           <w:rFonts w:ascii="Times New Roman" w:hAnsi="Times New Roman" w:eastAsia="宋体" w:cs="Times New Roman"/>
+          <w:b/>
           <w:color w:val="000000"/>
           <w:sz w:val="30"/>
           <w:szCs w:val="30"/>
-          <w:b/>
         </w:rPr>
-        <w:t xml:space="preserve">学    号</w:t>
+        <w:t>指导教师</w:t>
       </w:r>
       <w:r>
         <w:tab/>
@@ -325,49 +332,17 @@
       <w:r>
         <w:rPr>
           <w:rFonts w:ascii="Times New Roman" w:hAnsi="Times New Roman" w:eastAsia="宋体" w:cs="Times New Roman"/>
+          <w:b/>
           <w:color w:val="000000"/>
           <w:sz w:val="30"/>
           <w:szCs w:val="30"/>
-          <w:b/>
         </w:rPr>
-        <w:t xml:space="preserve">42353012</w:t>
+        <w:t>王磊</w:t>
       </w:r>
     </w:p>
     <w:p>
       <w:pPr>
-        <w:ind w:left="600"/>
-        <w:snapToGrid w:val="0"/>
-        <w:spacing w:before="100" w:after="180" w:line="440" w:lineRule="exact"/>
-        <w:tabs>
-          <w:tab w:val="left" w:pos="2300"/>
-        </w:tabs>
-      </w:pPr>
-      <w:r>
-        <w:rPr>
-          <w:rFonts w:ascii="Times New Roman" w:hAnsi="Times New Roman" w:eastAsia="宋体" w:cs="Times New Roman"/>
-          <w:color w:val="000000"/>
-          <w:sz w:val="30"/>
-          <w:szCs w:val="30"/>
-          <w:b/>
-        </w:rPr>
-        <w:t xml:space="preserve">指导教师</w:t>
-      </w:r>
-      <w:r>
-        <w:tab/>
-      </w:r>
-      <w:r>
-        <w:rPr>
-          <w:rFonts w:ascii="Times New Roman" w:hAnsi="Times New Roman" w:eastAsia="宋体" w:cs="Times New Roman"/>
-          <w:color w:val="000000"/>
-          <w:sz w:val="30"/>
-          <w:szCs w:val="30"/>
-          <w:b/>
-        </w:rPr>
-        <w:t xml:space="preserve">王磊</w:t>
-      </w:r>
-    </w:p>
-    <w:p>
-      <w:pPr>
+        <w:spacing w:before="100" w:after="100" w:line="280" w:lineRule="auto"/>
         <w:jc w:val="center"/>
         <w:rPr>
           <w:rFonts w:hint="eastAsia" w:ascii="宋体" w:hAnsi="宋体" w:eastAsia="宋体" w:cs="宋体"/>
@@ -375,8 +350,69 @@
           <w:sz w:val="30"/>
           <w:szCs w:val="30"/>
         </w:rPr>
+      </w:pPr>
+    </w:p>
+    <w:p>
+      <w:pPr>
         <w:spacing w:before="100" w:after="100" w:line="280" w:lineRule="auto"/>
+        <w:jc w:val="center"/>
+        <w:rPr>
+          <w:rFonts w:hint="eastAsia" w:ascii="宋体" w:hAnsi="宋体" w:eastAsia="宋体" w:cs="宋体"/>
+          <w:b/>
+          <w:sz w:val="30"/>
+          <w:szCs w:val="30"/>
+        </w:rPr>
       </w:pPr>
+    </w:p>
+    <w:p>
+      <w:pPr>
+        <w:spacing w:before="100" w:after="100" w:line="280" w:lineRule="auto"/>
+        <w:jc w:val="center"/>
+        <w:rPr>
+          <w:rFonts w:hint="eastAsia" w:ascii="宋体" w:hAnsi="宋体" w:eastAsia="宋体" w:cs="宋体"/>
+          <w:b/>
+          <w:sz w:val="30"/>
+          <w:szCs w:val="30"/>
+        </w:rPr>
+      </w:pPr>
+    </w:p>
+    <w:p>
+      <w:pPr>
+        <w:spacing w:before="100" w:after="100" w:line="280" w:lineRule="auto"/>
+        <w:jc w:val="center"/>
+        <w:rPr>
+          <w:rFonts w:hint="eastAsia" w:ascii="宋体" w:hAnsi="宋体" w:eastAsia="宋体" w:cs="宋体"/>
+          <w:b/>
+          <w:sz w:val="30"/>
+          <w:szCs w:val="30"/>
+        </w:rPr>
+      </w:pPr>
+    </w:p>
+    <w:p>
+      <w:pPr>
+        <w:spacing w:before="100" w:after="100" w:line="280" w:lineRule="auto"/>
+        <w:jc w:val="center"/>
+        <w:rPr>
+          <w:rFonts w:hint="eastAsia" w:ascii="宋体" w:hAnsi="宋体" w:eastAsia="宋体" w:cs="宋体"/>
+          <w:b/>
+          <w:sz w:val="30"/>
+          <w:szCs w:val="30"/>
+        </w:rPr>
+      </w:pPr>
+    </w:p>
+    <w:p>
+      <w:pPr>
+        <w:spacing w:before="100" w:after="100" w:line="280" w:lineRule="auto"/>
+        <w:jc w:val="center"/>
+        <w:rPr>
+          <w:rFonts w:hint="eastAsia" w:ascii="宋体" w:hAnsi="宋体" w:eastAsia="宋体" w:cs="宋体"/>
+          <w:b/>
+          <w:sz w:val="30"/>
+          <w:szCs w:val="30"/>
+        </w:rPr>
+      </w:pPr>
+      <w:bookmarkStart w:id="0" w:name="_GoBack"/>
+      <w:bookmarkEnd w:id="0"/>
       <w:r>
         <w:rPr>
           <w:rFonts w:hint="eastAsia" w:ascii="宋体" w:hAnsi="宋体" w:eastAsia="宋体" w:cs="宋体"/>
@@ -389,6 +425,7 @@
     </w:p>
     <w:p>
       <w:pPr>
+        <w:spacing w:before="100" w:after="100" w:line="280" w:lineRule="auto"/>
         <w:jc w:val="center"/>
         <w:rPr>
           <w:rFonts w:hint="eastAsia" w:ascii="宋体" w:hAnsi="宋体" w:eastAsia="宋体" w:cs="宋体"/>
@@ -396,7 +433,6 @@
           <w:sz w:val="30"/>
           <w:szCs w:val="30"/>
         </w:rPr>
-        <w:spacing w:before="100" w:after="100" w:line="280" w:lineRule="auto"/>
       </w:pPr>
       <w:r>
         <w:rPr>
@@ -460,20 +496,22 @@
             <w:right w:w="108" w:type="dxa"/>
           </w:tblCellMar>
         </w:tblPrEx>
-        <w:trPr/>
         <w:tc>
           <w:tcPr>
             <w:tcW w:w="2263" w:type="dxa"/>
+            <w:tcMar>
+              <w:top w:w="70" w:type="dxa"/>
+              <w:left w:w="120" w:type="dxa"/>
+              <w:bottom w:w="70" w:type="dxa"/>
+              <w:right w:w="120" w:type="dxa"/>
+            </w:tcMar>
             <w:vAlign w:val="center"/>
-            <w:tcMar>
-              <w:left w:w="120" w:type="dxa"/>
-              <w:right w:w="120" w:type="dxa"/>
-              <w:top w:w="70" w:type="dxa"/>
-              <w:bottom w:w="70" w:type="dxa"/>
-            </w:tcMar>
           </w:tcPr>
           <w:p>
             <w:pPr>
+              <w:keepNext w:val="0"/>
+              <w:snapToGrid w:val="0"/>
+              <w:spacing w:before="80" w:after="60" w:line="320" w:lineRule="exact"/>
               <w:jc w:val="center"/>
               <w:rPr>
                 <w:rFonts w:hint="eastAsia" w:ascii="仿宋" w:hAnsi="仿宋" w:eastAsia="仿宋" w:cs="仿宋"/>
@@ -482,9 +520,6 @@
                 <w:sz w:val="24"/>
                 <w:szCs w:val="24"/>
               </w:rPr>
-              <w:snapToGrid w:val="0"/>
-              <w:keepNext w:val="0"/>
-              <w:spacing w:before="80" w:after="60" w:line="320" w:lineRule="exact"/>
             </w:pPr>
             <w:r>
               <w:rPr>
@@ -501,64 +536,67 @@
         <w:tc>
           <w:tcPr>
             <w:tcW w:w="2273" w:type="dxa"/>
+            <w:tcMar>
+              <w:top w:w="70" w:type="dxa"/>
+              <w:left w:w="120" w:type="dxa"/>
+              <w:bottom w:w="70" w:type="dxa"/>
+              <w:right w:w="120" w:type="dxa"/>
+            </w:tcMar>
             <w:vAlign w:val="center"/>
-            <w:tcMar>
-              <w:left w:w="120" w:type="dxa"/>
-              <w:right w:w="120" w:type="dxa"/>
-              <w:top w:w="70" w:type="dxa"/>
-              <w:bottom w:w="70" w:type="dxa"/>
-            </w:tcMar>
           </w:tcPr>
           <w:p>
             <w:pPr>
+              <w:keepNext w:val="0"/>
+              <w:widowControl/>
+              <w:snapToGrid w:val="0"/>
+              <w:spacing w:before="0" w:after="45" w:line="320" w:lineRule="exact"/>
               <w:jc w:val="center"/>
+            </w:pPr>
+            <w:r>
+              <w:rPr>
+                <w:rFonts w:ascii="Times New Roman" w:hAnsi="Times New Roman" w:eastAsia="宋体" w:cs="Times New Roman"/>
+                <w:color w:val="000000"/>
+                <w:sz w:val="24"/>
+                <w:szCs w:val="24"/>
+              </w:rPr>
+              <w:t>（3）毕业实习</w:t>
+            </w:r>
+          </w:p>
+          <w:p>
+            <w:pPr>
+              <w:keepNext w:val="0"/>
+              <w:widowControl/>
+              <w:snapToGrid w:val="0"/>
               <w:spacing w:before="0" w:after="45" w:line="320" w:lineRule="exact"/>
-              <w:snapToGrid w:val="0"/>
-              <w:widowControl/>
-              <w:keepNext w:val="0"/>
-            </w:pPr>
-            <w:r>
-              <w:rPr>
-                <w:rFonts w:ascii="Times New Roman" w:hAnsi="Times New Roman" w:eastAsia="宋体" w:cs="Times New Roman"/>
-                <w:color w:val="000000"/>
-                <w:sz w:val="24"/>
-                <w:szCs w:val="24"/>
-              </w:rPr>
-              <w:t xml:space="preserve">（3）毕业实习</w:t>
-            </w:r>
-          </w:p>
-          <w:p>
-            <w:pPr>
               <w:jc w:val="center"/>
-              <w:spacing w:before="0" w:after="45" w:line="320" w:lineRule="exact"/>
-              <w:snapToGrid w:val="0"/>
-              <w:widowControl/>
-              <w:keepNext w:val="0"/>
-            </w:pPr>
-            <w:r>
-              <w:rPr>
-                <w:rFonts w:ascii="Times New Roman" w:hAnsi="Times New Roman" w:eastAsia="宋体" w:cs="Times New Roman"/>
-                <w:color w:val="000000"/>
-                <w:sz w:val="24"/>
-                <w:szCs w:val="24"/>
-              </w:rPr>
-              <w:t xml:space="preserve">或实践</w:t>
+            </w:pPr>
+            <w:r>
+              <w:rPr>
+                <w:rFonts w:ascii="Times New Roman" w:hAnsi="Times New Roman" w:eastAsia="宋体" w:cs="Times New Roman"/>
+                <w:color w:val="000000"/>
+                <w:sz w:val="24"/>
+                <w:szCs w:val="24"/>
+              </w:rPr>
+              <w:t>或实践</w:t>
             </w:r>
           </w:p>
         </w:tc>
         <w:tc>
           <w:tcPr>
             <w:tcW w:w="2275" w:type="dxa"/>
+            <w:tcMar>
+              <w:top w:w="70" w:type="dxa"/>
+              <w:left w:w="120" w:type="dxa"/>
+              <w:bottom w:w="70" w:type="dxa"/>
+              <w:right w:w="120" w:type="dxa"/>
+            </w:tcMar>
             <w:vAlign w:val="center"/>
-            <w:tcMar>
-              <w:left w:w="120" w:type="dxa"/>
-              <w:right w:w="120" w:type="dxa"/>
-              <w:top w:w="70" w:type="dxa"/>
-              <w:bottom w:w="70" w:type="dxa"/>
-            </w:tcMar>
           </w:tcPr>
           <w:p>
             <w:pPr>
+              <w:keepNext w:val="0"/>
+              <w:snapToGrid w:val="0"/>
+              <w:spacing w:before="80" w:after="60" w:line="320" w:lineRule="exact"/>
               <w:jc w:val="center"/>
               <w:rPr>
                 <w:rFonts w:hint="eastAsia" w:ascii="仿宋" w:hAnsi="仿宋" w:eastAsia="仿宋" w:cs="仿宋"/>
@@ -567,9 +605,6 @@
                 <w:sz w:val="24"/>
                 <w:szCs w:val="24"/>
               </w:rPr>
-              <w:snapToGrid w:val="0"/>
-              <w:keepNext w:val="0"/>
-              <w:spacing w:before="80" w:after="60" w:line="320" w:lineRule="exact"/>
             </w:pPr>
             <w:r>
               <w:rPr>
@@ -586,30 +621,30 @@
         <w:tc>
           <w:tcPr>
             <w:tcW w:w="1625" w:type="dxa"/>
+            <w:tcMar>
+              <w:top w:w="70" w:type="dxa"/>
+              <w:left w:w="120" w:type="dxa"/>
+              <w:bottom w:w="70" w:type="dxa"/>
+              <w:right w:w="120" w:type="dxa"/>
+            </w:tcMar>
             <w:vAlign w:val="center"/>
-            <w:tcMar>
-              <w:left w:w="120" w:type="dxa"/>
-              <w:right w:w="120" w:type="dxa"/>
-              <w:top w:w="70" w:type="dxa"/>
-              <w:bottom w:w="70" w:type="dxa"/>
-            </w:tcMar>
           </w:tcPr>
           <w:p>
             <w:pPr>
+              <w:keepNext w:val="0"/>
+              <w:widowControl/>
+              <w:snapToGrid w:val="0"/>
+              <w:spacing w:before="0" w:after="45" w:line="320" w:lineRule="exact"/>
               <w:jc w:val="center"/>
-              <w:spacing w:before="0" w:after="45" w:line="320" w:lineRule="exact"/>
-              <w:snapToGrid w:val="0"/>
-              <w:widowControl/>
-              <w:keepNext w:val="0"/>
-            </w:pPr>
-            <w:r>
-              <w:rPr>
-                <w:rFonts w:ascii="Times New Roman" w:hAnsi="Times New Roman" w:eastAsia="宋体" w:cs="Times New Roman"/>
-                <w:color w:val="000000"/>
-                <w:sz w:val="24"/>
-                <w:szCs w:val="24"/>
-              </w:rPr>
-              <w:t xml:space="preserve">B 应用研究</w:t>
+            </w:pPr>
+            <w:r>
+              <w:rPr>
+                <w:rFonts w:ascii="Times New Roman" w:hAnsi="Times New Roman" w:eastAsia="宋体" w:cs="Times New Roman"/>
+                <w:color w:val="000000"/>
+                <w:sz w:val="24"/>
+                <w:szCs w:val="24"/>
+              </w:rPr>
+              <w:t>B 应用研究</w:t>
             </w:r>
           </w:p>
         </w:tc>
@@ -631,95 +666,92 @@
             <w:right w:w="108" w:type="dxa"/>
           </w:tblCellMar>
         </w:tblPrEx>
-        <w:trPr>
-          <w:cantSplit w:val="0"/>
-        </w:trPr>
         <w:tc>
           <w:tcPr>
             <w:tcW w:w="8436" w:type="dxa"/>
             <w:gridSpan w:val="4"/>
             <w:tcMar>
+              <w:top w:w="70" w:type="dxa"/>
               <w:left w:w="120" w:type="dxa"/>
+              <w:bottom w:w="70" w:type="dxa"/>
               <w:right w:w="120" w:type="dxa"/>
-              <w:top w:w="70" w:type="dxa"/>
-              <w:bottom w:w="70" w:type="dxa"/>
             </w:tcMar>
           </w:tcPr>
           <w:p>
             <w:pPr>
-              <w:jc w:val="left"/>
+              <w:keepNext w:val="0"/>
+              <w:keepLines/>
+              <w:widowControl/>
+              <w:snapToGrid w:val="0"/>
               <w:spacing w:before="80" w:after="60" w:line="320" w:lineRule="exact"/>
-              <w:snapToGrid w:val="0"/>
-              <w:widowControl/>
-              <w:keepNext w:val="0"/>
-              <w:keepLines/>
+              <w:jc w:val="left"/>
             </w:pPr>
             <w:r>
               <w:rPr>
                 <w:rFonts w:ascii="Times New Roman" w:hAnsi="Times New Roman" w:eastAsia="仿宋" w:cs="Times New Roman"/>
-                <w:color w:val="000000"/>
-                <w:sz w:val="24"/>
-                <w:szCs w:val="24"/>
                 <w:b/>
-              </w:rPr>
-              <w:t xml:space="preserve">一、选题意义</w:t>
-            </w:r>
-          </w:p>
-          <w:p>
-            <w:pPr>
+                <w:color w:val="000000"/>
+                <w:sz w:val="24"/>
+                <w:szCs w:val="24"/>
+              </w:rPr>
+              <w:t>一、选题意义</w:t>
+            </w:r>
+          </w:p>
+          <w:p>
+            <w:pPr>
+              <w:keepNext w:val="0"/>
+              <w:widowControl/>
+              <w:snapToGrid w:val="0"/>
+              <w:spacing w:before="0" w:after="45" w:line="320" w:lineRule="exact"/>
+              <w:ind w:firstLine="480"/>
               <w:jc w:val="both"/>
+            </w:pPr>
+            <w:r>
+              <w:rPr>
+                <w:rFonts w:ascii="Times New Roman" w:hAnsi="Times New Roman" w:eastAsia="宋体" w:cs="Times New Roman"/>
+                <w:color w:val="000000"/>
+                <w:sz w:val="24"/>
+                <w:szCs w:val="24"/>
+              </w:rPr>
+              <w:t>本选题来源于本人在实习期间对多资产配置策略的整理。桥水的风险分散理念使我关注到，资金比例相同并不意味着承担的风险相同。股票、债券与货币市场工具的波动差异较大，单纯分散资金仍可能使风险集中在少数资产上。风险预算为配置提供了可解释的参考，但投资者还需要权衡组合总风险与预期收益。</w:t>
+            </w:r>
+          </w:p>
+          <w:p>
+            <w:pPr>
+              <w:keepNext w:val="0"/>
+              <w:widowControl/>
+              <w:snapToGrid w:val="0"/>
               <w:spacing w:before="0" w:after="45" w:line="320" w:lineRule="exact"/>
-              <w:snapToGrid w:val="0"/>
-              <w:widowControl/>
-              <w:keepNext w:val="0"/>
               <w:ind w:firstLine="480"/>
-            </w:pPr>
-            <w:r>
-              <w:rPr>
-                <w:rFonts w:ascii="Times New Roman" w:hAnsi="Times New Roman" w:eastAsia="宋体" w:cs="Times New Roman"/>
-                <w:color w:val="000000"/>
-                <w:sz w:val="24"/>
-                <w:szCs w:val="24"/>
-              </w:rPr>
-              <w:t xml:space="preserve">本选题来源于本人在实习期间对多资产配置策略的整理。桥水的风险分散理念使我关注到，资金比例相同并不意味着承担的风险相同。股票、债券与货币市场工具的波动差异较大，单纯分散资金仍可能使风险集中在少数资产上。风险预算为配置提供了可解释的参考，但投资者还需要权衡组合总风险与预期收益。</w:t>
-            </w:r>
-          </w:p>
-          <w:p>
-            <w:pPr>
               <w:jc w:val="both"/>
+            </w:pPr>
+            <w:r>
+              <w:rPr>
+                <w:rFonts w:ascii="Times New Roman" w:hAnsi="Times New Roman" w:eastAsia="宋体" w:cs="Times New Roman"/>
+                <w:color w:val="000000"/>
+                <w:sz w:val="24"/>
+                <w:szCs w:val="24"/>
+              </w:rPr>
+              <w:t>本文拟研究基于宽松风险平价的多资产 ETF 配置。在风险预算参考组合的基础上，引入组合方差和预测收益短缺惩罚，使最终权重能够在参考配置附近调整。方差项控制总风险，短缺项限制降低风险时付出的预测收益代价，收益目标取参考组合自身的预测收益。研究希望回答，这种调整能否在计入交易成本后形成合理的收益与风险取舍。</w:t>
+            </w:r>
+          </w:p>
+          <w:p>
+            <w:pPr>
+              <w:keepNext w:val="0"/>
+              <w:widowControl/>
+              <w:snapToGrid w:val="0"/>
               <w:spacing w:before="0" w:after="45" w:line="320" w:lineRule="exact"/>
-              <w:snapToGrid w:val="0"/>
-              <w:widowControl/>
-              <w:keepNext w:val="0"/>
               <w:ind w:firstLine="480"/>
-            </w:pPr>
-            <w:r>
-              <w:rPr>
-                <w:rFonts w:ascii="Times New Roman" w:hAnsi="Times New Roman" w:eastAsia="宋体" w:cs="Times New Roman"/>
-                <w:color w:val="000000"/>
-                <w:sz w:val="24"/>
-                <w:szCs w:val="24"/>
-              </w:rPr>
-              <w:t xml:space="preserve">本文拟研究基于宽松风险平价的多资产 ETF 配置。在风险预算参考组合的基础上，引入组合方差和预测收益短缺惩罚，使最终权重能够在参考配置附近调整。方差项控制总风险，短缺项限制降低风险时付出的预测收益代价，收益目标取参考组合自身的预测收益。研究希望回答，这种调整能否在计入交易成本后形成合理的收益与风险取舍。</w:t>
-            </w:r>
-          </w:p>
-          <w:p>
-            <w:pPr>
               <w:jc w:val="both"/>
-              <w:spacing w:before="0" w:after="45" w:line="320" w:lineRule="exact"/>
-              <w:snapToGrid w:val="0"/>
-              <w:widowControl/>
-              <w:keepNext w:val="0"/>
-              <w:ind w:firstLine="480"/>
-            </w:pPr>
-            <w:r>
-              <w:rPr>
-                <w:rFonts w:ascii="Times New Roman" w:hAnsi="Times New Roman" w:eastAsia="宋体" w:cs="Times New Roman"/>
-                <w:color w:val="000000"/>
-                <w:sz w:val="24"/>
-                <w:szCs w:val="24"/>
-              </w:rPr>
-              <w:t xml:space="preserve">选用境内上市 ETF，有助于将配置思想落实到可交易工具。数学上的重点是将金融偏好表达为明确的目标和约束，并用凸优化方法可靠求解；实证重点是解释各项目标怎样改变持仓及随后表现。研究以既有方法的组合应用为基础，预期贡献在于模型设定的可解释性和实际配置效果的检验。</w:t>
+            </w:pPr>
+            <w:r>
+              <w:rPr>
+                <w:rFonts w:ascii="Times New Roman" w:hAnsi="Times New Roman" w:eastAsia="宋体" w:cs="Times New Roman"/>
+                <w:color w:val="000000"/>
+                <w:sz w:val="24"/>
+                <w:szCs w:val="24"/>
+              </w:rPr>
+              <w:t>选用境内上市 ETF，有助于将配置思想落实到可交易工具。数学上的重点是将金融偏好表达为明确的目标和约束，并用凸优化方法可靠求解；实证重点是解释各项目标怎样改变持仓及随后表现。研究以既有方法的组合应用为基础，预期贡献在于模型设定的可解释性和实际配置效果的检验。</w:t>
             </w:r>
           </w:p>
         </w:tc>
@@ -741,114 +773,111 @@
             <w:right w:w="108" w:type="dxa"/>
           </w:tblCellMar>
         </w:tblPrEx>
-        <w:trPr>
-          <w:cantSplit w:val="0"/>
-        </w:trPr>
         <w:tc>
           <w:tcPr>
             <w:tcW w:w="8436" w:type="dxa"/>
             <w:gridSpan w:val="4"/>
             <w:tcMar>
+              <w:top w:w="70" w:type="dxa"/>
               <w:left w:w="120" w:type="dxa"/>
+              <w:bottom w:w="70" w:type="dxa"/>
               <w:right w:w="120" w:type="dxa"/>
-              <w:top w:w="70" w:type="dxa"/>
-              <w:bottom w:w="70" w:type="dxa"/>
             </w:tcMar>
           </w:tcPr>
           <w:p>
             <w:pPr>
-              <w:jc w:val="left"/>
+              <w:keepNext w:val="0"/>
+              <w:keepLines/>
+              <w:widowControl/>
+              <w:snapToGrid w:val="0"/>
               <w:spacing w:before="80" w:after="60" w:line="320" w:lineRule="exact"/>
-              <w:snapToGrid w:val="0"/>
-              <w:widowControl/>
-              <w:keepNext w:val="0"/>
-              <w:keepLines/>
+              <w:jc w:val="left"/>
             </w:pPr>
             <w:r>
               <w:rPr>
                 <w:rFonts w:ascii="Times New Roman" w:hAnsi="Times New Roman" w:eastAsia="仿宋" w:cs="Times New Roman"/>
-                <w:color w:val="000000"/>
-                <w:sz w:val="24"/>
-                <w:szCs w:val="24"/>
                 <w:b/>
-              </w:rPr>
-              <w:t xml:space="preserve">二、国内外研究现状概述</w:t>
-            </w:r>
-          </w:p>
-          <w:p>
-            <w:pPr>
+                <w:color w:val="000000"/>
+                <w:sz w:val="24"/>
+                <w:szCs w:val="24"/>
+              </w:rPr>
+              <w:t>二、国内外研究现状概述</w:t>
+            </w:r>
+          </w:p>
+          <w:p>
+            <w:pPr>
+              <w:keepNext w:val="0"/>
+              <w:widowControl/>
+              <w:snapToGrid w:val="0"/>
+              <w:spacing w:before="0" w:after="45" w:line="320" w:lineRule="exact"/>
+              <w:ind w:firstLine="480"/>
               <w:jc w:val="both"/>
+            </w:pPr>
+            <w:r>
+              <w:rPr>
+                <w:rFonts w:ascii="Times New Roman" w:hAnsi="Times New Roman" w:eastAsia="宋体" w:cs="Times New Roman"/>
+                <w:color w:val="000000"/>
+                <w:sz w:val="24"/>
+                <w:szCs w:val="24"/>
+              </w:rPr>
+              <w:t>国内研究已将基准跟踪、收益要求与投资者偏好纳入组合优化。王志强、赵庆研究跟踪误差投资组合的鲁棒优化及基金应用；刘家和等考虑状态依赖和损失厌恶；王宗润、何瑭瑭讨论动态参照点及相关风险控制。景奎将 ESG 整合与双层风险预算结合。这些研究分别为参考配置、目标以下的不利偏离及风险预算扩展提供了研究背景，具体目标函数与本文有所不同。</w:t>
+            </w:r>
+          </w:p>
+          <w:p>
+            <w:pPr>
+              <w:keepNext w:val="0"/>
+              <w:widowControl/>
+              <w:snapToGrid w:val="0"/>
               <w:spacing w:before="0" w:after="45" w:line="320" w:lineRule="exact"/>
-              <w:snapToGrid w:val="0"/>
-              <w:widowControl/>
-              <w:keepNext w:val="0"/>
               <w:ind w:firstLine="480"/>
-            </w:pPr>
-            <w:r>
-              <w:rPr>
-                <w:rFonts w:ascii="Times New Roman" w:hAnsi="Times New Roman" w:eastAsia="宋体" w:cs="Times New Roman"/>
-                <w:color w:val="000000"/>
-                <w:sz w:val="24"/>
-                <w:szCs w:val="24"/>
-              </w:rPr>
-              <w:t xml:space="preserve">国内研究已将基准跟踪、收益要求与投资者偏好纳入组合优化。王志强、赵庆[1]研究跟踪误差投资组合的鲁棒优化及基金应用；刘家和等[2]考虑状态依赖和损失厌恶；王宗润、何瑭瑭[3]讨论动态参照点及相关风险控制。景奎[4]将 ESG 整合与双层风险预算结合。这些研究分别为参考配置、目标以下的不利偏离及风险预算扩展提供了研究背景，具体目标函数与本文有所不同。</w:t>
-            </w:r>
-          </w:p>
-          <w:p>
-            <w:pPr>
               <w:jc w:val="both"/>
+            </w:pPr>
+            <w:r>
+              <w:rPr>
+                <w:rFonts w:ascii="Times New Roman" w:hAnsi="Times New Roman" w:eastAsia="宋体" w:cs="Times New Roman"/>
+                <w:color w:val="000000"/>
+                <w:sz w:val="24"/>
+                <w:szCs w:val="24"/>
+              </w:rPr>
+              <w:t>国外研究中，Markowitz以预期收益和方差构建组合选择框架。Spinu将风险预算计算写为含负对数项的凸优化问题，为本文第一阶段提供直接计算方法。Feng 与 Palomar的 SCRIP 框架将风险平价与投资者偏好结合，其中包含组合方差偏好项，说明在风险分散要求之外进一步控制总风险具有文献先例。</w:t>
+            </w:r>
+          </w:p>
+          <w:p>
+            <w:pPr>
+              <w:keepNext w:val="0"/>
+              <w:widowControl/>
+              <w:snapToGrid w:val="0"/>
               <w:spacing w:before="0" w:after="45" w:line="320" w:lineRule="exact"/>
-              <w:snapToGrid w:val="0"/>
-              <w:widowControl/>
-              <w:keepNext w:val="0"/>
               <w:ind w:firstLine="480"/>
-            </w:pPr>
-            <w:r>
-              <w:rPr>
-                <w:rFonts w:ascii="Times New Roman" w:hAnsi="Times New Roman" w:eastAsia="宋体" w:cs="Times New Roman"/>
-                <w:color w:val="000000"/>
-                <w:sz w:val="24"/>
-                <w:szCs w:val="24"/>
-              </w:rPr>
-              <w:t xml:space="preserve">国外研究中，Markowitz[5]以预期收益和方差构建组合选择框架。Spinu[6]将风险预算计算写为含负对数项的凸优化问题，为本文第一阶段提供直接计算方法。Feng 与 Palomar[7]的 SCRIP 框架将风险平价与投资者偏好结合，其中包含组合方差偏好项，说明在风险分散要求之外进一步控制总风险具有文献先例。</w:t>
-            </w:r>
-          </w:p>
-          <w:p>
-            <w:pPr>
               <w:jc w:val="both"/>
+            </w:pPr>
+            <w:r>
+              <w:rPr>
+                <w:rFonts w:ascii="Times New Roman" w:hAnsi="Times New Roman" w:eastAsia="宋体" w:cs="Times New Roman"/>
+                <w:color w:val="000000"/>
+                <w:sz w:val="24"/>
+                <w:szCs w:val="24"/>
+              </w:rPr>
+              <w:t>Bourgeron 等采用围绕参考组合的平方范数正则化，为控制权重偏离提供方法依据。Gambeta 与 Kwon研究宽松风险平价中的收益与风险权衡，并根据风险平价组合的预期收益设置收益目标。本文将当期风险预算参考同时用于确定跟踪中心与收益目标，以保持两阶段之间的联系。</w:t>
+            </w:r>
+          </w:p>
+          <w:p>
+            <w:pPr>
+              <w:keepNext w:val="0"/>
+              <w:widowControl/>
+              <w:snapToGrid w:val="0"/>
               <w:spacing w:before="0" w:after="45" w:line="320" w:lineRule="exact"/>
-              <w:snapToGrid w:val="0"/>
-              <w:widowControl/>
-              <w:keepNext w:val="0"/>
               <w:ind w:firstLine="480"/>
-            </w:pPr>
-            <w:r>
-              <w:rPr>
-                <w:rFonts w:ascii="Times New Roman" w:hAnsi="Times New Roman" w:eastAsia="宋体" w:cs="Times New Roman"/>
-                <w:color w:val="000000"/>
-                <w:sz w:val="24"/>
-                <w:szCs w:val="24"/>
-              </w:rPr>
-              <w:t xml:space="preserve">Bourgeron 等[8]采用围绕参考组合的平方范数正则化，为控制权重偏离提供方法依据。Gambeta 与 Kwon[9]研究宽松风险平价中的收益与风险权衡，并根据风险平价组合的预期收益设置收益目标。本文将当期风险预算参考同时用于确定跟踪中心与收益目标，以保持两阶段之间的联系。</w:t>
-            </w:r>
-          </w:p>
-          <w:p>
-            <w:pPr>
               <w:jc w:val="both"/>
-              <w:spacing w:before="0" w:after="45" w:line="320" w:lineRule="exact"/>
-              <w:snapToGrid w:val="0"/>
-              <w:widowControl/>
-              <w:keepNext w:val="0"/>
-              <w:ind w:firstLine="480"/>
-            </w:pPr>
-            <w:r>
-              <w:rPr>
-                <w:rFonts w:ascii="Times New Roman" w:hAnsi="Times New Roman" w:eastAsia="宋体" w:cs="Times New Roman"/>
-                <w:color w:val="000000"/>
-                <w:sz w:val="24"/>
-                <w:szCs w:val="24"/>
-              </w:rPr>
-              <w:t xml:space="preserve">预测收益短缺的平方惩罚需要区分数学形式与经济解释。Nocedal 与 Wright[10]介绍不等式违反量的二次罚函数；Boyd 等[11]讨论组合优化中以惩罚处理软约束。这为对低于目标的预测收益差额取正部并平方提供了方法支撑。Siegmann 与 Lucas[12]研究损失厌恶偏好下的财务规划，对基准财富以下的随机短缺使用二次惩罚。本文惩罚的是预测均值的不足，与随机财富短缺的期望并不相同，引用时将明确这一边界。</w:t>
+            </w:pPr>
+            <w:r>
+              <w:rPr>
+                <w:rFonts w:ascii="Times New Roman" w:hAnsi="Times New Roman" w:eastAsia="宋体" w:cs="Times New Roman"/>
+                <w:color w:val="000000"/>
+                <w:sz w:val="24"/>
+                <w:szCs w:val="24"/>
+              </w:rPr>
+              <w:t>预测收益短缺的平方惩罚需要区分数学形式与经济解释。Nocedal 与 Wright介绍不等式违反量的二次罚函数；Boyd 等讨论组合优化中以惩罚处理软约束。这为对低于目标的预测收益差额取正部并平方提供了方法支撑。Siegmann 与 Lucas研究损失厌恶偏好下的财务规划，对基准财富以下的随机短缺使用二次惩罚。本文惩罚的是预测均值的不足，与随机财富短缺的期望并不相同，引用时将明确这一边界。</w:t>
             </w:r>
           </w:p>
         </w:tc>
@@ -884,10 +913,7 @@
         </w:tblCellMar>
       </w:tblPr>
       <w:tblGrid>
-        <w:gridCol w:w="2263"/>
-        <w:gridCol w:w="2273"/>
-        <w:gridCol w:w="2275"/>
-        <w:gridCol w:w="1625"/>
+        <w:gridCol w:w="8436"/>
       </w:tblGrid>
       <w:tr>
         <w:tblPrEx>
@@ -906,68 +932,64 @@
             <w:right w:w="108" w:type="dxa"/>
           </w:tblCellMar>
         </w:tblPrEx>
-        <w:trPr>
-          <w:cantSplit w:val="0"/>
-        </w:trPr>
         <w:tc>
           <w:tcPr>
             <w:tcW w:w="8436" w:type="dxa"/>
-            <w:gridSpan w:val="4"/>
             <w:tcMar>
+              <w:top w:w="70" w:type="dxa"/>
               <w:left w:w="120" w:type="dxa"/>
+              <w:bottom w:w="70" w:type="dxa"/>
               <w:right w:w="120" w:type="dxa"/>
-              <w:top w:w="70" w:type="dxa"/>
-              <w:bottom w:w="70" w:type="dxa"/>
             </w:tcMar>
           </w:tcPr>
           <w:p>
             <w:pPr>
+              <w:keepNext w:val="0"/>
+              <w:widowControl/>
+              <w:snapToGrid w:val="0"/>
+              <w:spacing w:before="0" w:after="45" w:line="320" w:lineRule="exact"/>
+              <w:ind w:firstLine="480"/>
               <w:jc w:val="both"/>
-              <w:spacing w:before="0" w:after="45" w:line="320" w:lineRule="exact"/>
-              <w:snapToGrid w:val="0"/>
-              <w:widowControl/>
-              <w:keepNext w:val="0"/>
-              <w:ind w:firstLine="480"/>
-            </w:pPr>
-            <w:r>
-              <w:rPr>
-                <w:rFonts w:ascii="Times New Roman" w:hAnsi="Times New Roman" w:eastAsia="宋体" w:cs="Times New Roman"/>
-                <w:color w:val="000000"/>
-                <w:sz w:val="24"/>
-                <w:szCs w:val="24"/>
-              </w:rPr>
-              <w:t xml:space="preserve">上述文献能够支持模型中各项设定的来源。本文拟将风险预算参考、方差控制和预测收益短缺整合为两阶段凸模型，采用仅使用历史信息的年度参数更新，并通过对照实验评价其必要性。文献依据说明建模选择有合理来源，最终配置是否有效仍由真实数据检验。</w:t>
-            </w:r>
-          </w:p>
-          <w:p>
-            <w:pPr>
-              <w:jc w:val="left"/>
+            </w:pPr>
+            <w:r>
+              <w:rPr>
+                <w:rFonts w:ascii="Times New Roman" w:hAnsi="Times New Roman" w:eastAsia="宋体" w:cs="Times New Roman"/>
+                <w:color w:val="000000"/>
+                <w:sz w:val="24"/>
+                <w:szCs w:val="24"/>
+              </w:rPr>
+              <w:t>上述文献能够支持模型中各项设定的来源。本文拟将风险预算参考、方差控制和预测收益短缺整合为两阶段凸模型，采用仅使用历史信息的年度参数更新，并通过对照实验评价其必要性。文献依据说明建模选择有合理来源，最终配置是否有效仍由真实数据检验。</w:t>
+            </w:r>
+          </w:p>
+          <w:p>
+            <w:pPr>
+              <w:keepNext w:val="0"/>
+              <w:keepLines/>
+              <w:widowControl/>
+              <w:snapToGrid w:val="0"/>
               <w:spacing w:before="80" w:after="60" w:line="320" w:lineRule="exact"/>
-              <w:snapToGrid w:val="0"/>
-              <w:widowControl/>
-              <w:keepNext w:val="0"/>
-              <w:keepLines/>
+              <w:jc w:val="left"/>
             </w:pPr>
             <w:r>
               <w:rPr>
                 <w:rFonts w:ascii="Times New Roman" w:hAnsi="Times New Roman" w:eastAsia="仿宋" w:cs="Times New Roman"/>
-                <w:color w:val="000000"/>
-                <w:sz w:val="24"/>
-                <w:szCs w:val="24"/>
                 <w:b/>
-              </w:rPr>
-              <w:t xml:space="preserve">主要参考文献</w:t>
-            </w:r>
-          </w:p>
-          <w:p>
-            <w:pPr>
-              <w:jc w:val="left"/>
+                <w:color w:val="000000"/>
+                <w:sz w:val="24"/>
+                <w:szCs w:val="24"/>
+              </w:rPr>
+              <w:t>主要参考文献</w:t>
+            </w:r>
+          </w:p>
+          <w:p>
+            <w:pPr>
+              <w:keepNext w:val="0"/>
+              <w:keepLines/>
+              <w:widowControl/>
+              <w:snapToGrid w:val="0"/>
               <w:spacing w:before="0" w:after="45" w:line="280" w:lineRule="exact"/>
-              <w:snapToGrid w:val="0"/>
-              <w:widowControl/>
-              <w:keepNext w:val="0"/>
-              <w:ind w:left="360" w:hanging="360"/>
-              <w:keepLines w:val="1"/>
+              <w:ind w:left="0" w:hanging="0"/>
+              <w:jc w:val="left"/>
             </w:pPr>
             <w:r>
               <w:rPr>
@@ -976,18 +998,18 @@
                 <w:sz w:val="21"/>
                 <w:szCs w:val="21"/>
               </w:rPr>
-              <w:t xml:space="preserve">[1] 王志强, 赵庆. 跟踪误差投资组合鲁棒优化模型及其衍生模型在基金市场中的应用[J]. 山东财经大学学报, 2015, 27(1): 1-8.</w:t>
-            </w:r>
-          </w:p>
-          <w:p>
-            <w:pPr>
-              <w:jc w:val="left"/>
+              <w:t>王志强, 赵庆. 跟踪误差投资组合鲁棒优化模型及其衍生模型在基金市场中的应用[J]. 山东财经大学学报, 2015, 27(1): 1-8.</w:t>
+            </w:r>
+          </w:p>
+          <w:p>
+            <w:pPr>
+              <w:keepNext w:val="0"/>
+              <w:keepLines/>
+              <w:widowControl/>
+              <w:snapToGrid w:val="0"/>
               <w:spacing w:before="0" w:after="45" w:line="280" w:lineRule="exact"/>
-              <w:snapToGrid w:val="0"/>
-              <w:widowControl/>
-              <w:keepNext w:val="0"/>
-              <w:ind w:left="360" w:hanging="360"/>
-              <w:keepLines w:val="1"/>
+              <w:ind w:left="0" w:hanging="0"/>
+              <w:jc w:val="left"/>
             </w:pPr>
             <w:r>
               <w:rPr>
@@ -996,18 +1018,18 @@
                 <w:sz w:val="21"/>
                 <w:szCs w:val="21"/>
               </w:rPr>
-              <w:t xml:space="preserve">[2] 刘家和, 金秀, 苑莹, 等. 状态依赖和损失厌恶下的鲁棒投资组合模型及实证[J]. 管理工程学报, 2018, 32(2): 196-201.</w:t>
-            </w:r>
-          </w:p>
-          <w:p>
-            <w:pPr>
-              <w:jc w:val="left"/>
+              <w:t>刘家和, 金秀, 苑莹, 等. 状态依赖和损失厌恶下的鲁棒投资组合模型及实证[J]. 管理工程学报, 2018, 32(2): 196-201.</w:t>
+            </w:r>
+          </w:p>
+          <w:p>
+            <w:pPr>
+              <w:keepNext w:val="0"/>
+              <w:keepLines/>
+              <w:widowControl/>
+              <w:snapToGrid w:val="0"/>
               <w:spacing w:before="0" w:after="45" w:line="280" w:lineRule="exact"/>
-              <w:snapToGrid w:val="0"/>
-              <w:widowControl/>
-              <w:keepNext w:val="0"/>
-              <w:ind w:left="360" w:hanging="360"/>
-              <w:keepLines w:val="1"/>
+              <w:ind w:left="0" w:hanging="0"/>
+              <w:jc w:val="left"/>
             </w:pPr>
             <w:r>
               <w:rPr>
@@ -1016,18 +1038,18 @@
                 <w:sz w:val="21"/>
                 <w:szCs w:val="21"/>
               </w:rPr>
-              <w:t xml:space="preserve">[3] 王宗润, 何瑭瑭. 基于动态参照点的鲁棒投资组合模型及其拓展[J]. 运筹与管理, 2021, 30(6): 124-131.</w:t>
-            </w:r>
-          </w:p>
-          <w:p>
-            <w:pPr>
-              <w:jc w:val="left"/>
+              <w:t>王宗润, 何瑭瑭. 基于动态参照点的鲁棒投资组合模型及其拓展[J]. 运筹与管理, 2021, 30(6): 124-131.</w:t>
+            </w:r>
+          </w:p>
+          <w:p>
+            <w:pPr>
+              <w:keepNext w:val="0"/>
+              <w:keepLines/>
+              <w:widowControl/>
+              <w:snapToGrid w:val="0"/>
               <w:spacing w:before="0" w:after="45" w:line="280" w:lineRule="exact"/>
-              <w:snapToGrid w:val="0"/>
-              <w:widowControl/>
-              <w:keepNext w:val="0"/>
-              <w:ind w:left="360" w:hanging="360"/>
-              <w:keepLines w:val="1"/>
+              <w:ind w:left="0" w:hanging="0"/>
+              <w:jc w:val="left"/>
             </w:pPr>
             <w:r>
               <w:rPr>
@@ -1036,18 +1058,18 @@
                 <w:sz w:val="21"/>
                 <w:szCs w:val="21"/>
               </w:rPr>
-              <w:t xml:space="preserve">[4] 景奎. 基于 ESG 整合的双层风险预算投资组合模型研究[J]. 统计与信息论坛, 2026, 41(9): 65-75.</w:t>
-            </w:r>
-          </w:p>
-          <w:p>
-            <w:pPr>
-              <w:jc w:val="left"/>
+              <w:t>景奎. 基于 ESG 整合的双层风险预算投资组合模型研究[J]. 统计与信息论坛, 2026, 41(9): 65-75.</w:t>
+            </w:r>
+          </w:p>
+          <w:p>
+            <w:pPr>
+              <w:keepNext w:val="0"/>
+              <w:keepLines/>
+              <w:widowControl/>
+              <w:snapToGrid w:val="0"/>
               <w:spacing w:before="0" w:after="45" w:line="280" w:lineRule="exact"/>
-              <w:snapToGrid w:val="0"/>
-              <w:widowControl/>
-              <w:keepNext w:val="0"/>
-              <w:ind w:left="360" w:hanging="360"/>
-              <w:keepLines w:val="1"/>
+              <w:ind w:left="0" w:hanging="0"/>
+              <w:jc w:val="left"/>
             </w:pPr>
             <w:r>
               <w:rPr>
@@ -1056,18 +1078,18 @@
                 <w:sz w:val="21"/>
                 <w:szCs w:val="21"/>
               </w:rPr>
-              <w:t xml:space="preserve">[5] MARKOWITZ H M. Portfolio Selection: Efficient Diversification of Investments[M]. New York: John Wiley &amp; Sons, 1959.</w:t>
-            </w:r>
-          </w:p>
-          <w:p>
-            <w:pPr>
-              <w:jc w:val="left"/>
+              <w:t>MARKOWITZ H M. Portfolio Selection: Efficient Diversification of Investments[M]. New York: John Wiley &amp; Sons, 1959.</w:t>
+            </w:r>
+          </w:p>
+          <w:p>
+            <w:pPr>
+              <w:keepNext w:val="0"/>
+              <w:keepLines/>
+              <w:widowControl/>
+              <w:snapToGrid w:val="0"/>
               <w:spacing w:before="0" w:after="45" w:line="280" w:lineRule="exact"/>
-              <w:snapToGrid w:val="0"/>
-              <w:widowControl/>
-              <w:keepNext w:val="0"/>
-              <w:ind w:left="360" w:hanging="360"/>
-              <w:keepLines w:val="1"/>
+              <w:ind w:left="0" w:hanging="0"/>
+              <w:jc w:val="left"/>
             </w:pPr>
             <w:r>
               <w:rPr>
@@ -1076,18 +1098,18 @@
                 <w:sz w:val="21"/>
                 <w:szCs w:val="21"/>
               </w:rPr>
-              <w:t xml:space="preserve">[6] SPINU F. An Algorithm for Computing Risk Parity Weights[R]. SSRN, 2013. DOI 10.2139/ssrn.2297383.</w:t>
-            </w:r>
-          </w:p>
-          <w:p>
-            <w:pPr>
-              <w:jc w:val="left"/>
+              <w:t>SPINU F. An Algorithm for Computing Risk Parity Weights[R]. SSRN, 2013. DOI 10.2139/ssrn.2297383.</w:t>
+            </w:r>
+          </w:p>
+          <w:p>
+            <w:pPr>
+              <w:keepNext w:val="0"/>
+              <w:keepLines/>
+              <w:widowControl/>
+              <w:snapToGrid w:val="0"/>
               <w:spacing w:before="0" w:after="45" w:line="280" w:lineRule="exact"/>
-              <w:snapToGrid w:val="0"/>
-              <w:widowControl/>
-              <w:keepNext w:val="0"/>
-              <w:ind w:left="360" w:hanging="360"/>
-              <w:keepLines w:val="1"/>
+              <w:ind w:left="0" w:hanging="0"/>
+              <w:jc w:val="left"/>
             </w:pPr>
             <w:r>
               <w:rPr>
@@ -1096,18 +1118,18 @@
                 <w:sz w:val="21"/>
                 <w:szCs w:val="21"/>
               </w:rPr>
-              <w:t xml:space="preserve">[7] FENG Y, PALOMAR D P. SCRIP: Successive Convex Optimization Methods for Risk Parity Portfolio Design[J]. IEEE Transactions on Signal Processing, 2015, 63(19): 5285-5300.</w:t>
-            </w:r>
-          </w:p>
-          <w:p>
-            <w:pPr>
-              <w:jc w:val="left"/>
+              <w:t>FENG Y, PALOMAR D P. SCRIP: Successive Convex Optimization Methods for Risk Parity Portfolio Design[J]. IEEE Transactions on Signal Processing, 2015, 63(19): 5285-5300.</w:t>
+            </w:r>
+          </w:p>
+          <w:p>
+            <w:pPr>
+              <w:keepNext w:val="0"/>
+              <w:keepLines/>
+              <w:widowControl/>
+              <w:snapToGrid w:val="0"/>
               <w:spacing w:before="0" w:after="45" w:line="280" w:lineRule="exact"/>
-              <w:snapToGrid w:val="0"/>
-              <w:widowControl/>
-              <w:keepNext w:val="0"/>
-              <w:ind w:left="360" w:hanging="360"/>
-              <w:keepLines w:val="1"/>
+              <w:ind w:left="0" w:hanging="0"/>
+              <w:jc w:val="left"/>
             </w:pPr>
             <w:r>
               <w:rPr>
@@ -1116,18 +1138,18 @@
                 <w:sz w:val="21"/>
                 <w:szCs w:val="21"/>
               </w:rPr>
-              <w:t xml:space="preserve">[8] BOURGERON T, LEZMI E, RONCALLI T. Robust Asset Allocation for Robo-Advisors[R]. Paris: Amundi Asset Management, 2018.</w:t>
-            </w:r>
-          </w:p>
-          <w:p>
-            <w:pPr>
-              <w:jc w:val="left"/>
+              <w:t>BOURGERON T, LEZMI E, RONCALLI T. Robust Asset Allocation for Robo-Advisors[R]. Paris: Amundi Asset Management, 2018.</w:t>
+            </w:r>
+          </w:p>
+          <w:p>
+            <w:pPr>
+              <w:keepNext w:val="0"/>
+              <w:keepLines/>
+              <w:widowControl/>
+              <w:snapToGrid w:val="0"/>
               <w:spacing w:before="0" w:after="45" w:line="280" w:lineRule="exact"/>
-              <w:snapToGrid w:val="0"/>
-              <w:widowControl/>
-              <w:keepNext w:val="0"/>
-              <w:ind w:left="360" w:hanging="360"/>
-              <w:keepLines w:val="1"/>
+              <w:ind w:left="0" w:hanging="0"/>
+              <w:jc w:val="left"/>
             </w:pPr>
             <w:r>
               <w:rPr>
@@ -1136,18 +1158,18 @@
                 <w:sz w:val="21"/>
                 <w:szCs w:val="21"/>
               </w:rPr>
-              <w:t xml:space="preserve">[9] GAMBETA V, KWON R. Risk Return Trade-Off in Relaxed Risk Parity Portfolio Optimization[J]. Journal of Risk and Financial Management, 2020, 13(10): 237.</w:t>
-            </w:r>
-          </w:p>
-          <w:p>
-            <w:pPr>
-              <w:jc w:val="left"/>
+              <w:t>GAMBETA V, KWON R. Risk Return Trade-Off in Relaxed Risk Parity Portfolio Optimization[J]. Journal of Risk and Financial Management, 2020, 13(10): 237.</w:t>
+            </w:r>
+          </w:p>
+          <w:p>
+            <w:pPr>
+              <w:keepNext w:val="0"/>
+              <w:keepLines/>
+              <w:widowControl/>
+              <w:snapToGrid w:val="0"/>
               <w:spacing w:before="0" w:after="45" w:line="280" w:lineRule="exact"/>
-              <w:snapToGrid w:val="0"/>
-              <w:widowControl/>
-              <w:keepNext w:val="0"/>
-              <w:ind w:left="360" w:hanging="360"/>
-              <w:keepLines w:val="1"/>
+              <w:ind w:left="0" w:hanging="0"/>
+              <w:jc w:val="left"/>
             </w:pPr>
             <w:r>
               <w:rPr>
@@ -1156,18 +1178,18 @@
                 <w:sz w:val="21"/>
                 <w:szCs w:val="21"/>
               </w:rPr>
-              <w:t xml:space="preserve">[10] NOCEDAL J, WRIGHT S J. Numerical Optimization[M]. 2nd ed. New York: Springer, 2006.</w:t>
-            </w:r>
-          </w:p>
-          <w:p>
-            <w:pPr>
-              <w:jc w:val="left"/>
+              <w:t>NOCEDAL J, WRIGHT S J. Numerical Optimization[M]. 2nd ed. New York: Springer, 2006.</w:t>
+            </w:r>
+          </w:p>
+          <w:p>
+            <w:pPr>
+              <w:keepNext w:val="0"/>
+              <w:keepLines/>
+              <w:widowControl/>
+              <w:snapToGrid w:val="0"/>
               <w:spacing w:before="0" w:after="45" w:line="280" w:lineRule="exact"/>
-              <w:snapToGrid w:val="0"/>
-              <w:widowControl/>
-              <w:keepNext w:val="0"/>
-              <w:ind w:left="360" w:hanging="360"/>
-              <w:keepLines w:val="1"/>
+              <w:ind w:left="0" w:hanging="0"/>
+              <w:jc w:val="left"/>
             </w:pPr>
             <w:r>
               <w:rPr>
@@ -1176,18 +1198,18 @@
                 <w:sz w:val="21"/>
                 <w:szCs w:val="21"/>
               </w:rPr>
-              <w:t xml:space="preserve">[11] BOYD S, BUSSETI E, DIAMOND S, et al. Multi-Period Trading via Convex Optimization[J]. Foundations and Trends in Optimization, 2017, 3(1): 1-76.</w:t>
-            </w:r>
-          </w:p>
-          <w:p>
-            <w:pPr>
-              <w:jc w:val="left"/>
+              <w:t>BOYD S, BUSSETI E, DIAMOND S, et al. Multi-Period Trading via Convex Optimization[J]. Foundations and Trends in Optimization, 2017, 3(1): 1-76.</w:t>
+            </w:r>
+          </w:p>
+          <w:p>
+            <w:pPr>
+              <w:keepNext w:val="0"/>
+              <w:keepLines/>
+              <w:widowControl/>
+              <w:snapToGrid w:val="0"/>
               <w:spacing w:before="0" w:after="45" w:line="280" w:lineRule="exact"/>
-              <w:snapToGrid w:val="0"/>
-              <w:widowControl/>
-              <w:keepNext w:val="0"/>
-              <w:ind w:left="360" w:hanging="360"/>
-              <w:keepLines w:val="1"/>
+              <w:ind w:left="0" w:hanging="0"/>
+              <w:jc w:val="left"/>
             </w:pPr>
             <w:r>
               <w:rPr>
@@ -1196,7 +1218,7 @@
                 <w:sz w:val="21"/>
                 <w:szCs w:val="21"/>
               </w:rPr>
-              <w:t xml:space="preserve">[12] SIEGMANN A, LUCAS A. Discrete-Time Financial Planning Models Under Loss-Averse Preferences[J]. Operations Research, 2005, 53(3): 403-414.</w:t>
+              <w:t>SIEGMANN A, LUCAS A. Discrete-Time Financial Planning Models Under Loss-Averse Preferences[J]. Operations Research, 2005, 53(3): 403-414.</w:t>
             </w:r>
           </w:p>
         </w:tc>
@@ -1232,10 +1254,7 @@
         </w:tblCellMar>
       </w:tblPr>
       <w:tblGrid>
-        <w:gridCol w:w="2263"/>
-        <w:gridCol w:w="2273"/>
-        <w:gridCol w:w="2275"/>
-        <w:gridCol w:w="1625"/>
+        <w:gridCol w:w="8436"/>
       </w:tblGrid>
       <w:tr>
         <w:tblPrEx>
@@ -1254,91 +1273,88 @@
             <w:right w:w="108" w:type="dxa"/>
           </w:tblCellMar>
         </w:tblPrEx>
-        <w:trPr>
-          <w:cantSplit w:val="0"/>
-        </w:trPr>
         <w:tc>
           <w:tcPr>
             <w:tcW w:w="8436" w:type="dxa"/>
-            <w:gridSpan w:val="4"/>
             <w:tcMar>
+              <w:top w:w="70" w:type="dxa"/>
               <w:left w:w="120" w:type="dxa"/>
+              <w:bottom w:w="70" w:type="dxa"/>
               <w:right w:w="120" w:type="dxa"/>
-              <w:top w:w="70" w:type="dxa"/>
-              <w:bottom w:w="70" w:type="dxa"/>
             </w:tcMar>
           </w:tcPr>
           <w:p>
             <w:pPr>
-              <w:jc w:val="left"/>
+              <w:keepNext w:val="0"/>
+              <w:keepLines/>
+              <w:widowControl/>
+              <w:snapToGrid w:val="0"/>
               <w:spacing w:before="80" w:after="60" w:line="320" w:lineRule="exact"/>
-              <w:snapToGrid w:val="0"/>
-              <w:widowControl/>
-              <w:keepNext w:val="0"/>
-              <w:keepLines/>
+              <w:jc w:val="left"/>
             </w:pPr>
             <w:r>
               <w:rPr>
                 <w:rFonts w:ascii="Times New Roman" w:hAnsi="Times New Roman" w:eastAsia="仿宋" w:cs="Times New Roman"/>
-                <w:color w:val="000000"/>
-                <w:sz w:val="24"/>
-                <w:szCs w:val="24"/>
                 <w:b/>
-              </w:rPr>
-              <w:t xml:space="preserve">三、主要研究内容</w:t>
-            </w:r>
-          </w:p>
-          <w:p>
-            <w:pPr>
-              <w:jc w:val="left"/>
+                <w:color w:val="000000"/>
+                <w:sz w:val="24"/>
+                <w:szCs w:val="24"/>
+              </w:rPr>
+              <w:t>三、主要研究内容</w:t>
+            </w:r>
+          </w:p>
+          <w:p>
+            <w:pPr>
+              <w:keepNext w:val="0"/>
+              <w:keepLines/>
+              <w:widowControl/>
+              <w:snapToGrid w:val="0"/>
               <w:spacing w:before="80" w:after="60" w:line="320" w:lineRule="exact"/>
-              <w:snapToGrid w:val="0"/>
-              <w:widowControl/>
-              <w:keepNext w:val="0"/>
-              <w:keepLines/>
+              <w:jc w:val="left"/>
             </w:pPr>
             <w:r>
               <w:rPr>
                 <w:rFonts w:ascii="Times New Roman" w:hAnsi="Times New Roman" w:eastAsia="仿宋" w:cs="Times New Roman"/>
-                <w:color w:val="000000"/>
-                <w:sz w:val="24"/>
-                <w:szCs w:val="24"/>
                 <w:b/>
-              </w:rPr>
-              <w:t xml:space="preserve">1. 风险预算参考与最终配置模型</w:t>
-            </w:r>
-          </w:p>
-          <w:p>
-            <w:pPr>
+                <w:color w:val="000000"/>
+                <w:sz w:val="24"/>
+                <w:szCs w:val="24"/>
+              </w:rPr>
+              <w:t>1. 风险预算参考与最终配置模型</w:t>
+            </w:r>
+          </w:p>
+          <w:p>
+            <w:pPr>
+              <w:keepNext w:val="0"/>
+              <w:widowControl/>
+              <w:snapToGrid w:val="0"/>
+              <w:spacing w:before="0" w:after="45" w:line="320" w:lineRule="exact"/>
+              <w:ind w:firstLine="480"/>
               <w:jc w:val="both"/>
-              <w:spacing w:before="0" w:after="45" w:line="320" w:lineRule="exact"/>
-              <w:snapToGrid w:val="0"/>
-              <w:widowControl/>
-              <w:keepNext w:val="0"/>
-              <w:ind w:firstLine="480"/>
-            </w:pPr>
-            <w:r>
-              <w:rPr>
-                <w:rFonts w:ascii="Times New Roman" w:hAnsi="Times New Roman" w:eastAsia="宋体" w:cs="Times New Roman"/>
-                <w:color w:val="000000"/>
-                <w:sz w:val="24"/>
-                <w:szCs w:val="24"/>
-              </w:rPr>
-              <w:t xml:space="preserve">第一阶段根据当期合格资产的协方差矩阵求解等风险预算组合，归一化得到参考权重 q。第二阶段以 q 为中心优化最终权重 w，在多头、满额投资且无杠杆的约束下，综合考虑资金权重偏离、组合方差与预测收益短缺。本文所称“宽松”是允许最终组合偏离严格的风险预算关系。</w:t>
-            </w:r>
-          </w:p>
-          <w:p>
-            <w:pPr>
+            </w:pPr>
+            <w:r>
+              <w:rPr>
+                <w:rFonts w:ascii="Times New Roman" w:hAnsi="Times New Roman" w:eastAsia="宋体" w:cs="Times New Roman"/>
+                <w:color w:val="000000"/>
+                <w:sz w:val="24"/>
+                <w:szCs w:val="24"/>
+              </w:rPr>
+              <w:t>第一阶段根据当期合格资产的协方差矩阵求解等风险预算组合，归一化得到参考权重 q。第二阶段以 q 为中心优化最终权重 w，在多头、满额投资且无杠杆的约束下，综合考虑资金权重偏离、组合方差与预测收益短缺。本文所称“宽松”是允许最终组合偏离严格的风险预算关系。</w:t>
+            </w:r>
+          </w:p>
+          <w:p>
+            <w:pPr>
+              <w:keepNext w:val="0"/>
+              <w:keepLines/>
+              <w:widowControl/>
+              <w:snapToGrid w:val="0"/>
+              <w:spacing w:before="100" w:after="100" w:line="300" w:lineRule="atLeast"/>
               <w:jc w:val="center"/>
-              <w:spacing w:before="100" w:after="100" w:line="300" w:lineRule="atLeast"/>
-              <w:snapToGrid w:val="0"/>
-              <w:widowControl/>
-              <w:keepNext w:val="0"/>
-              <w:keepLines/>
             </w:pPr>
             <m:oMathPara>
               <m:oMath>
                 <m:eqArr>
+                  <m:eqArrPr/>
                   <m:e>
                     <m:r>
                       <m:rPr>
@@ -1381,99 +1397,99 @@
           </w:p>
           <w:p>
             <w:pPr>
+              <w:keepNext w:val="0"/>
+              <w:widowControl/>
+              <w:snapToGrid w:val="0"/>
+              <w:spacing w:before="0" w:after="45" w:line="320" w:lineRule="exact"/>
+              <w:ind w:firstLine="480"/>
               <w:jc w:val="both"/>
+            </w:pPr>
+            <w:r>
+              <w:rPr>
+                <w:rFonts w:ascii="Times New Roman" w:hAnsi="Times New Roman" w:eastAsia="宋体" w:cs="Times New Roman"/>
+                <w:color w:val="000000"/>
+                <w:sz w:val="24"/>
+                <w:szCs w:val="24"/>
+              </w:rPr>
+              <w:t>其中，μ 为预测年化收益向量，Σ 为年化协方差矩阵。v 和 s 为求解前固定的正尺度，用于统一两项惩罚的量级；λᵥ、λᵣ 为非负惩罚系数。第一项限制偏离参考组合，第二项降低估计方差，第三项仅在预测收益低于目标时产生惩罚。预测收益达到目标后，该项为零。</w:t>
+            </w:r>
+          </w:p>
+          <w:p>
+            <w:pPr>
+              <w:keepNext w:val="0"/>
+              <w:keepLines/>
+              <w:widowControl/>
+              <w:snapToGrid w:val="0"/>
+              <w:spacing w:before="80" w:after="60" w:line="320" w:lineRule="exact"/>
+              <w:jc w:val="left"/>
+            </w:pPr>
+            <w:r>
+              <w:rPr>
+                <w:rFonts w:ascii="Times New Roman" w:hAnsi="Times New Roman" w:eastAsia="仿宋" w:cs="Times New Roman"/>
+                <w:b/>
+                <w:color w:val="000000"/>
+                <w:sz w:val="24"/>
+                <w:szCs w:val="24"/>
+              </w:rPr>
+              <w:t>2. 参数更新与求解方法</w:t>
+            </w:r>
+          </w:p>
+          <w:p>
+            <w:pPr>
+              <w:keepNext w:val="0"/>
+              <w:widowControl/>
+              <w:snapToGrid w:val="0"/>
               <w:spacing w:before="0" w:after="45" w:line="320" w:lineRule="exact"/>
-              <w:snapToGrid w:val="0"/>
-              <w:widowControl/>
-              <w:keepNext w:val="0"/>
               <w:ind w:firstLine="480"/>
-            </w:pPr>
-            <w:r>
-              <w:rPr>
-                <w:rFonts w:ascii="Times New Roman" w:hAnsi="Times New Roman" w:eastAsia="宋体" w:cs="Times New Roman"/>
-                <w:color w:val="000000"/>
-                <w:sz w:val="24"/>
-                <w:szCs w:val="24"/>
-              </w:rPr>
-              <w:t xml:space="preserve">其中，μ 为预测年化收益向量，Σ 为年化协方差矩阵。v 和 s 为求解前固定的正尺度，用于统一两项惩罚的量级；λᵥ、λᵣ 为非负惩罚系数。第一项限制偏离参考组合，第二项降低估计方差，第三项仅在预测收益低于目标时产生惩罚。预测收益达到目标后，该项为零。</w:t>
-            </w:r>
-          </w:p>
-          <w:p>
-            <w:pPr>
-              <w:jc w:val="left"/>
+              <w:jc w:val="both"/>
+            </w:pPr>
+            <w:r>
+              <w:rPr>
+                <w:rFonts w:ascii="Times New Roman" w:hAnsi="Times New Roman" w:eastAsia="宋体" w:cs="Times New Roman"/>
+                <w:color w:val="000000"/>
+                <w:sz w:val="24"/>
+                <w:szCs w:val="24"/>
+              </w:rPr>
+              <w:t>整理目标函数的凸性、可行域与最优性条件，说明标准求解器适用的原因。使用 CVXPY 表达模型并调用 CLARABEL 求解，不另行开发通用优化算法。参数按年度更新，候选设置和选择均只使用生效日前的历史数据，选定后在下一年度保持固定。</w:t>
+            </w:r>
+          </w:p>
+          <w:p>
+            <w:pPr>
+              <w:keepNext w:val="0"/>
+              <w:keepLines/>
+              <w:widowControl/>
+              <w:snapToGrid w:val="0"/>
               <w:spacing w:before="80" w:after="60" w:line="320" w:lineRule="exact"/>
-              <w:snapToGrid w:val="0"/>
-              <w:widowControl/>
-              <w:keepNext w:val="0"/>
-              <w:keepLines/>
+              <w:jc w:val="left"/>
             </w:pPr>
             <w:r>
               <w:rPr>
                 <w:rFonts w:ascii="Times New Roman" w:hAnsi="Times New Roman" w:eastAsia="仿宋" w:cs="Times New Roman"/>
-                <w:color w:val="000000"/>
-                <w:sz w:val="24"/>
-                <w:szCs w:val="24"/>
                 <w:b/>
-              </w:rPr>
-              <w:t xml:space="preserve">2. 参数更新与求解方法</w:t>
-            </w:r>
-          </w:p>
-          <w:p>
-            <w:pPr>
+                <w:color w:val="000000"/>
+                <w:sz w:val="24"/>
+                <w:szCs w:val="24"/>
+              </w:rPr>
+              <w:t>3. 配置效果与模型作用检验</w:t>
+            </w:r>
+          </w:p>
+          <w:p>
+            <w:pPr>
+              <w:keepNext w:val="0"/>
+              <w:widowControl/>
+              <w:snapToGrid w:val="0"/>
+              <w:spacing w:before="0" w:after="45" w:line="320" w:lineRule="exact"/>
+              <w:ind w:firstLine="480"/>
               <w:jc w:val="both"/>
-              <w:spacing w:before="0" w:after="45" w:line="320" w:lineRule="exact"/>
-              <w:snapToGrid w:val="0"/>
-              <w:widowControl/>
-              <w:keepNext w:val="0"/>
-              <w:ind w:firstLine="480"/>
-            </w:pPr>
-            <w:r>
-              <w:rPr>
-                <w:rFonts w:ascii="Times New Roman" w:hAnsi="Times New Roman" w:eastAsia="宋体" w:cs="Times New Roman"/>
-                <w:color w:val="000000"/>
-                <w:sz w:val="24"/>
-                <w:szCs w:val="24"/>
-              </w:rPr>
-              <w:t xml:space="preserve">整理目标函数的凸性、可行域与最优性条件，说明标准求解器适用的原因。使用 CVXPY 表达模型并调用 CLARABEL 求解，不另行开发通用优化算法。参数按年度更新，候选设置和选择均只使用生效日前的历史数据，选定后在下一年度保持固定。</w:t>
-            </w:r>
-          </w:p>
-          <w:p>
-            <w:pPr>
-              <w:jc w:val="left"/>
-              <w:spacing w:before="80" w:after="60" w:line="320" w:lineRule="exact"/>
-              <w:snapToGrid w:val="0"/>
-              <w:widowControl/>
-              <w:keepNext w:val="0"/>
-              <w:keepLines/>
-            </w:pPr>
-            <w:r>
-              <w:rPr>
-                <w:rFonts w:ascii="Times New Roman" w:hAnsi="Times New Roman" w:eastAsia="仿宋" w:cs="Times New Roman"/>
-                <w:color w:val="000000"/>
-                <w:sz w:val="24"/>
-                <w:szCs w:val="24"/>
-                <w:b/>
-              </w:rPr>
-              <w:t xml:space="preserve">3. 配置效果与模型作用检验</w:t>
-            </w:r>
-          </w:p>
-          <w:p>
-            <w:pPr>
-              <w:jc w:val="both"/>
-              <w:spacing w:before="0" w:after="45" w:line="320" w:lineRule="exact"/>
-              <w:snapToGrid w:val="0"/>
-              <w:widowControl/>
-              <w:keepNext w:val="0"/>
-              <w:ind w:firstLine="480"/>
-            </w:pPr>
-            <w:r>
-              <w:rPr>
-                <w:rFonts w:ascii="Times New Roman" w:hAnsi="Times New Roman" w:eastAsia="宋体" w:cs="Times New Roman"/>
-                <w:color w:val="000000"/>
-                <w:sz w:val="24"/>
-                <w:szCs w:val="24"/>
-              </w:rPr>
-              <w:t xml:space="preserve">采用真实 ETF 数据开展扣费回测，以风险预算参考组合和简单配置为主要对照，同时报告 HRP Benchmark、HERC Benchmark 两种层次配置结果。通过去掉单项惩罚的比较，辨别方差项和收益短缺项各自的作用。评价结合收益、波动与回撤，并用持仓及换手解释差异；成本和分阶段比较保留能够支持结论的必要部分。</w:t>
+            </w:pPr>
+            <w:r>
+              <w:rPr>
+                <w:rFonts w:ascii="Times New Roman" w:hAnsi="Times New Roman" w:eastAsia="宋体" w:cs="Times New Roman"/>
+                <w:color w:val="000000"/>
+                <w:sz w:val="24"/>
+                <w:szCs w:val="24"/>
+              </w:rPr>
+              <w:t>采用真实 ETF 数据开展扣费回测，以风险预算参考组合和简单配置为主要对照，同时报告 HRP Benchmark、HERC Benchmark 两种层次配置结果。通过去掉单项惩罚的比较，辨别方差项和收益短缺项各自的作用。评价结合收益、波动与回撤，并用持仓及换手解释差异；成本和分阶段比较保留能够支持结论的必要部分。</w:t>
             </w:r>
           </w:p>
         </w:tc>
@@ -1509,10 +1525,7 @@
         </w:tblCellMar>
       </w:tblPr>
       <w:tblGrid>
-        <w:gridCol w:w="2263"/>
-        <w:gridCol w:w="2273"/>
-        <w:gridCol w:w="2275"/>
-        <w:gridCol w:w="1625"/>
+        <w:gridCol w:w="8436"/>
       </w:tblGrid>
       <w:tr>
         <w:tblPrEx>
@@ -1531,232 +1544,228 @@
             <w:right w:w="108" w:type="dxa"/>
           </w:tblCellMar>
         </w:tblPrEx>
-        <w:trPr>
-          <w:cantSplit w:val="0"/>
-        </w:trPr>
         <w:tc>
           <w:tcPr>
             <w:tcW w:w="8436" w:type="dxa"/>
-            <w:gridSpan w:val="4"/>
             <w:tcMar>
+              <w:top w:w="70" w:type="dxa"/>
               <w:left w:w="120" w:type="dxa"/>
+              <w:bottom w:w="70" w:type="dxa"/>
               <w:right w:w="120" w:type="dxa"/>
-              <w:top w:w="70" w:type="dxa"/>
-              <w:bottom w:w="70" w:type="dxa"/>
             </w:tcMar>
           </w:tcPr>
           <w:p>
             <w:pPr>
-              <w:jc w:val="left"/>
+              <w:keepNext w:val="0"/>
+              <w:keepLines/>
+              <w:widowControl/>
+              <w:snapToGrid w:val="0"/>
               <w:spacing w:before="80" w:after="60" w:line="320" w:lineRule="exact"/>
-              <w:snapToGrid w:val="0"/>
-              <w:widowControl/>
-              <w:keepNext w:val="0"/>
-              <w:keepLines/>
+              <w:jc w:val="left"/>
             </w:pPr>
             <w:r>
               <w:rPr>
                 <w:rFonts w:ascii="Times New Roman" w:hAnsi="Times New Roman" w:eastAsia="仿宋" w:cs="Times New Roman"/>
-                <w:color w:val="000000"/>
-                <w:sz w:val="24"/>
-                <w:szCs w:val="24"/>
                 <w:b/>
-              </w:rPr>
-              <w:t xml:space="preserve">四、拟采用的研究思路（方法、技术路线、可行性论证等）</w:t>
-            </w:r>
-          </w:p>
-          <w:p>
-            <w:pPr>
-              <w:jc w:val="left"/>
+                <w:color w:val="000000"/>
+                <w:sz w:val="24"/>
+                <w:szCs w:val="24"/>
+              </w:rPr>
+              <w:t>四、拟采用的研究思路（方法、技术路线、可行性论证等）</w:t>
+            </w:r>
+          </w:p>
+          <w:p>
+            <w:pPr>
+              <w:keepNext w:val="0"/>
+              <w:keepLines/>
+              <w:widowControl/>
+              <w:snapToGrid w:val="0"/>
               <w:spacing w:before="80" w:after="60" w:line="320" w:lineRule="exact"/>
-              <w:snapToGrid w:val="0"/>
-              <w:widowControl/>
-              <w:keepNext w:val="0"/>
-              <w:keepLines/>
+              <w:jc w:val="left"/>
             </w:pPr>
             <w:r>
               <w:rPr>
                 <w:rFonts w:ascii="Times New Roman" w:hAnsi="Times New Roman" w:eastAsia="仿宋" w:cs="Times New Roman"/>
-                <w:color w:val="000000"/>
-                <w:sz w:val="24"/>
-                <w:szCs w:val="24"/>
                 <w:b/>
-              </w:rPr>
-              <w:t xml:space="preserve">1. 文献分析与数学建模</w:t>
-            </w:r>
-          </w:p>
-          <w:p>
-            <w:pPr>
+                <w:color w:val="000000"/>
+                <w:sz w:val="24"/>
+                <w:szCs w:val="24"/>
+              </w:rPr>
+              <w:t>1. 文献分析与数学建模</w:t>
+            </w:r>
+          </w:p>
+          <w:p>
+            <w:pPr>
+              <w:keepNext w:val="0"/>
+              <w:widowControl/>
+              <w:snapToGrid w:val="0"/>
+              <w:spacing w:before="0" w:after="45" w:line="320" w:lineRule="exact"/>
+              <w:ind w:firstLine="480"/>
               <w:jc w:val="both"/>
+            </w:pPr>
+            <w:r>
+              <w:rPr>
+                <w:rFonts w:ascii="Times New Roman" w:hAnsi="Times New Roman" w:eastAsia="宋体" w:cs="Times New Roman"/>
+                <w:color w:val="000000"/>
+                <w:sz w:val="24"/>
+                <w:szCs w:val="24"/>
+              </w:rPr>
+              <w:t>围绕风险预算、均值与方差配置、参考正则化及软约束梳理文献，明确每个目标项的依据和本文的改动。对参考组合与最终权重分别建模，说明协方差正定处理、收益目标可行性及解的性质。本文优化的是连续资金权重，属于连续凸优化；与组合优化共享目标、约束和求解的研究思路，当前模型不含离散选股或整数持仓变量。</w:t>
+            </w:r>
+          </w:p>
+          <w:p>
+            <w:pPr>
+              <w:keepNext w:val="0"/>
+              <w:keepLines/>
+              <w:widowControl/>
+              <w:snapToGrid w:val="0"/>
+              <w:spacing w:before="80" w:after="60" w:line="320" w:lineRule="exact"/>
+              <w:jc w:val="left"/>
+            </w:pPr>
+            <w:r>
+              <w:rPr>
+                <w:rFonts w:ascii="Times New Roman" w:hAnsi="Times New Roman" w:eastAsia="仿宋" w:cs="Times New Roman"/>
+                <w:b/>
+                <w:color w:val="000000"/>
+                <w:sz w:val="24"/>
+                <w:szCs w:val="24"/>
+              </w:rPr>
+              <w:t>2. 数据处理与技术路线</w:t>
+            </w:r>
+          </w:p>
+          <w:p>
+            <w:pPr>
+              <w:keepNext w:val="0"/>
+              <w:widowControl/>
+              <w:snapToGrid w:val="0"/>
               <w:spacing w:before="0" w:after="45" w:line="320" w:lineRule="exact"/>
-              <w:snapToGrid w:val="0"/>
-              <w:widowControl/>
-              <w:keepNext w:val="0"/>
               <w:ind w:firstLine="480"/>
-            </w:pPr>
-            <w:r>
-              <w:rPr>
-                <w:rFonts w:ascii="Times New Roman" w:hAnsi="Times New Roman" w:eastAsia="宋体" w:cs="Times New Roman"/>
-                <w:color w:val="000000"/>
-                <w:sz w:val="24"/>
-                <w:szCs w:val="24"/>
-              </w:rPr>
-              <w:t xml:space="preserve">围绕风险预算、均值与方差配置、参考正则化及软约束梳理文献，明确每个目标项的依据和本文的改动。对参考组合与最终权重分别建模，说明协方差正定处理、收益目标可行性及解的性质。本文优化的是连续资金权重，属于连续凸优化；与组合优化共享目标、约束和求解的研究思路，当前模型不含离散选股或整数持仓变量。</w:t>
-            </w:r>
-          </w:p>
-          <w:p>
-            <w:pPr>
-              <w:jc w:val="left"/>
+              <w:jc w:val="both"/>
+            </w:pPr>
+            <w:r>
+              <w:rPr>
+                <w:rFonts w:ascii="Times New Roman" w:hAnsi="Times New Roman" w:eastAsia="宋体" w:cs="Times New Roman"/>
+                <w:color w:val="000000"/>
+                <w:sz w:val="24"/>
+                <w:szCs w:val="24"/>
+              </w:rPr>
+              <w:t>研究对象为覆盖股票、债券、货币市场及商品等类别的 30 只境内上市 ETF。根据上市时间和历史有效观察确定各期合格资产，避免使用尚不可交易的工具。当前回测评价区间为 2018 年 1 月 2 日至 2026 年 10 月 23 日。输入使用此前最多 252 个交易日，协方差采用 Ledoit-Wolf 收缩估计，预测收益采用半衰期为 20 个交易日的指数加权均值。</w:t>
+            </w:r>
+          </w:p>
+          <w:p>
+            <w:pPr>
+              <w:keepNext w:val="0"/>
+              <w:widowControl/>
+              <w:snapToGrid w:val="0"/>
+              <w:spacing w:before="0" w:after="45" w:line="320" w:lineRule="exact"/>
+              <w:ind w:firstLine="480"/>
+              <w:jc w:val="both"/>
+            </w:pPr>
+            <w:r>
+              <w:rPr>
+                <w:rFonts w:ascii="Times New Roman" w:hAnsi="Times New Roman" w:eastAsia="宋体" w:cs="Times New Roman"/>
+                <w:color w:val="000000"/>
+                <w:sz w:val="24"/>
+                <w:szCs w:val="24"/>
+              </w:rPr>
+              <w:t>每个调仓日依次完成数据筛选、输入估计、风险预算参考求解和最终权重求解，再按周调整持仓。收益目标等于同日参考组合的预测收益，优化输入在当次求解前固定。回测计入单边 3 个基点交易成本，收益与风险统计采用 252 个交易日年化，无风险利率按零处理。</w:t>
+            </w:r>
+          </w:p>
+          <w:p>
+            <w:pPr>
+              <w:keepNext w:val="0"/>
+              <w:keepLines/>
+              <w:widowControl/>
+              <w:snapToGrid w:val="0"/>
               <w:spacing w:before="80" w:after="60" w:line="320" w:lineRule="exact"/>
-              <w:snapToGrid w:val="0"/>
-              <w:widowControl/>
-              <w:keepNext w:val="0"/>
-              <w:keepLines/>
+              <w:jc w:val="left"/>
             </w:pPr>
             <w:r>
               <w:rPr>
                 <w:rFonts w:ascii="Times New Roman" w:hAnsi="Times New Roman" w:eastAsia="仿宋" w:cs="Times New Roman"/>
-                <w:color w:val="000000"/>
-                <w:sz w:val="24"/>
-                <w:szCs w:val="24"/>
                 <w:b/>
-              </w:rPr>
-              <w:t xml:space="preserve">2. 数据处理与技术路线</w:t>
-            </w:r>
-          </w:p>
-          <w:p>
-            <w:pPr>
+                <w:color w:val="000000"/>
+                <w:sz w:val="24"/>
+                <w:szCs w:val="24"/>
+              </w:rPr>
+              <w:t>3. 年度参数选择与实证安排</w:t>
+            </w:r>
+          </w:p>
+          <w:p>
+            <w:pPr>
+              <w:keepNext w:val="0"/>
+              <w:widowControl/>
+              <w:snapToGrid w:val="0"/>
+              <w:spacing w:before="0" w:after="45" w:line="320" w:lineRule="exact"/>
+              <w:ind w:firstLine="480"/>
               <w:jc w:val="both"/>
+            </w:pPr>
+            <w:r>
+              <w:rPr>
+                <w:rFonts w:ascii="Times New Roman" w:hAnsi="Times New Roman" w:eastAsia="宋体" w:cs="Times New Roman"/>
+                <w:color w:val="000000"/>
+                <w:sz w:val="24"/>
+                <w:szCs w:val="24"/>
+              </w:rPr>
+              <w:t>每次年度更新使用两个严格早于参数生效日的 252 日区间。较早区间形成候选尺度，较晚区间按扣费表现比较候选，采用一倍标准误规则选择，并保持下一年度参数固定。结合固定参数对照检验动态更新的作用；当多组候选表现接近时，如实报告参数辨识不足，不把选定值解释为唯一最优参数。</w:t>
+            </w:r>
+          </w:p>
+          <w:p>
+            <w:pPr>
+              <w:keepNext w:val="0"/>
+              <w:widowControl/>
+              <w:snapToGrid w:val="0"/>
               <w:spacing w:before="0" w:after="45" w:line="320" w:lineRule="exact"/>
-              <w:snapToGrid w:val="0"/>
-              <w:widowControl/>
-              <w:keepNext w:val="0"/>
               <w:ind w:firstLine="480"/>
-            </w:pPr>
-            <w:r>
-              <w:rPr>
-                <w:rFonts w:ascii="Times New Roman" w:hAnsi="Times New Roman" w:eastAsia="宋体" w:cs="Times New Roman"/>
-                <w:color w:val="000000"/>
-                <w:sz w:val="24"/>
-                <w:szCs w:val="24"/>
-              </w:rPr>
-              <w:t xml:space="preserve">研究对象为覆盖股票、债券、货币市场及商品等类别的 30 只境内上市 ETF。根据上市时间和历史有效观察确定各期合格资产，避免使用尚不可交易的工具。当前回测评价区间为 2018 年 1 月 2 日至 2026 年 10 月 23 日。输入使用此前最多 252 个交易日，协方差采用 Ledoit-Wolf 收缩估计，预测收益采用半衰期为 20 个交易日的指数加权均值。</w:t>
-            </w:r>
-          </w:p>
-          <w:p>
-            <w:pPr>
               <w:jc w:val="both"/>
+            </w:pPr>
+            <w:r>
+              <w:rPr>
+                <w:rFonts w:ascii="Times New Roman" w:hAnsi="Times New Roman" w:eastAsia="宋体" w:cs="Times New Roman"/>
+                <w:color w:val="000000"/>
+                <w:sz w:val="24"/>
+                <w:szCs w:val="24"/>
+              </w:rPr>
+              <w:t>实证先回答最终配置相对风险预算参考发生了什么变化，再以消融比较说明各项惩罚的作用，最后检查交易成本与阶段差异。如果低波动主要来自货币和债券配置，应同时呈现对应的收益代价，并辅以风险匹配比较，避免仅凭某一条净值曲线判断优劣。</w:t>
+            </w:r>
+          </w:p>
+          <w:p>
+            <w:pPr>
+              <w:keepNext w:val="0"/>
+              <w:keepLines/>
+              <w:widowControl/>
+              <w:snapToGrid w:val="0"/>
+              <w:spacing w:before="80" w:after="60" w:line="320" w:lineRule="exact"/>
+              <w:jc w:val="left"/>
+            </w:pPr>
+            <w:r>
+              <w:rPr>
+                <w:rFonts w:ascii="Times New Roman" w:hAnsi="Times New Roman" w:eastAsia="仿宋" w:cs="Times New Roman"/>
+                <w:b/>
+                <w:color w:val="000000"/>
+                <w:sz w:val="24"/>
+                <w:szCs w:val="24"/>
+              </w:rPr>
+              <w:t>4. 研究基础与可行性</w:t>
+            </w:r>
+          </w:p>
+          <w:p>
+            <w:pPr>
+              <w:keepNext w:val="0"/>
+              <w:widowControl/>
+              <w:snapToGrid w:val="0"/>
               <w:spacing w:before="0" w:after="45" w:line="320" w:lineRule="exact"/>
-              <w:snapToGrid w:val="0"/>
-              <w:widowControl/>
-              <w:keepNext w:val="0"/>
               <w:ind w:firstLine="480"/>
-            </w:pPr>
-            <w:r>
-              <w:rPr>
-                <w:rFonts w:ascii="Times New Roman" w:hAnsi="Times New Roman" w:eastAsia="宋体" w:cs="Times New Roman"/>
-                <w:color w:val="000000"/>
-                <w:sz w:val="24"/>
-                <w:szCs w:val="24"/>
-              </w:rPr>
-              <w:t xml:space="preserve">每个调仓日依次完成数据筛选、输入估计、风险预算参考求解和最终权重求解，再按周调整持仓。收益目标等于同日参考组合的预测收益，优化输入在当次求解前固定。回测计入单边 3 个基点交易成本，收益与风险统计采用 252 个交易日年化，无风险利率按零处理。</w:t>
-            </w:r>
-          </w:p>
-          <w:p>
-            <w:pPr>
-              <w:jc w:val="left"/>
-              <w:spacing w:before="80" w:after="60" w:line="320" w:lineRule="exact"/>
-              <w:snapToGrid w:val="0"/>
-              <w:widowControl/>
-              <w:keepNext w:val="0"/>
-              <w:keepLines/>
-            </w:pPr>
-            <w:r>
-              <w:rPr>
-                <w:rFonts w:ascii="Times New Roman" w:hAnsi="Times New Roman" w:eastAsia="仿宋" w:cs="Times New Roman"/>
-                <w:color w:val="000000"/>
-                <w:sz w:val="24"/>
-                <w:szCs w:val="24"/>
-                <w:b/>
-              </w:rPr>
-              <w:t xml:space="preserve">3. 年度参数选择与实证安排</w:t>
-            </w:r>
-          </w:p>
-          <w:p>
-            <w:pPr>
               <w:jc w:val="both"/>
-              <w:spacing w:before="0" w:after="45" w:line="320" w:lineRule="exact"/>
-              <w:snapToGrid w:val="0"/>
-              <w:widowControl/>
-              <w:keepNext w:val="0"/>
-              <w:ind w:firstLine="480"/>
-            </w:pPr>
-            <w:r>
-              <w:rPr>
-                <w:rFonts w:ascii="Times New Roman" w:hAnsi="Times New Roman" w:eastAsia="宋体" w:cs="Times New Roman"/>
-                <w:color w:val="000000"/>
-                <w:sz w:val="24"/>
-                <w:szCs w:val="24"/>
-              </w:rPr>
-              <w:t xml:space="preserve">每次年度更新使用两个严格早于参数生效日的 252 日区间。较早区间形成候选尺度，较晚区间按扣费表现比较候选，采用一倍标准误规则选择，并保持下一年度参数固定。结合固定参数对照检验动态更新的作用；当多组候选表现接近时，如实报告参数辨识不足，不把选定值解释为唯一最优参数。</w:t>
-            </w:r>
-          </w:p>
-          <w:p>
-            <w:pPr>
-              <w:jc w:val="both"/>
-              <w:spacing w:before="0" w:after="45" w:line="320" w:lineRule="exact"/>
-              <w:snapToGrid w:val="0"/>
-              <w:widowControl/>
-              <w:keepNext w:val="0"/>
-              <w:ind w:firstLine="480"/>
-            </w:pPr>
-            <w:r>
-              <w:rPr>
-                <w:rFonts w:ascii="Times New Roman" w:hAnsi="Times New Roman" w:eastAsia="宋体" w:cs="Times New Roman"/>
-                <w:color w:val="000000"/>
-                <w:sz w:val="24"/>
-                <w:szCs w:val="24"/>
-              </w:rPr>
-              <w:t xml:space="preserve">实证先回答最终配置相对风险预算参考发生了什么变化，再以消融比较说明各项惩罚的作用，最后检查交易成本与阶段差异。如果低波动主要来自货币和债券配置，应同时呈现对应的收益代价，并辅以风险匹配比较，避免仅凭某一条净值曲线判断优劣。</w:t>
-            </w:r>
-          </w:p>
-          <w:p>
-            <w:pPr>
-              <w:jc w:val="left"/>
-              <w:spacing w:before="80" w:after="60" w:line="320" w:lineRule="exact"/>
-              <w:snapToGrid w:val="0"/>
-              <w:widowControl/>
-              <w:keepNext w:val="0"/>
-              <w:keepLines/>
-            </w:pPr>
-            <w:r>
-              <w:rPr>
-                <w:rFonts w:ascii="Times New Roman" w:hAnsi="Times New Roman" w:eastAsia="仿宋" w:cs="Times New Roman"/>
-                <w:color w:val="000000"/>
-                <w:sz w:val="24"/>
-                <w:szCs w:val="24"/>
-                <w:b/>
-              </w:rPr>
-              <w:t xml:space="preserve">4. 研究基础与可行性</w:t>
-            </w:r>
-          </w:p>
-          <w:p>
-            <w:pPr>
-              <w:jc w:val="both"/>
-              <w:spacing w:before="0" w:after="45" w:line="320" w:lineRule="exact"/>
-              <w:snapToGrid w:val="0"/>
-              <w:widowControl/>
-              <w:keepNext w:val="0"/>
-              <w:ind w:firstLine="480"/>
-            </w:pPr>
-            <w:r>
-              <w:rPr>
-                <w:rFonts w:ascii="Times New Roman" w:hAnsi="Times New Roman" w:eastAsia="宋体" w:cs="Times New Roman"/>
-                <w:color w:val="000000"/>
-                <w:sz w:val="24"/>
-                <w:szCs w:val="24"/>
-              </w:rPr>
-              <w:t xml:space="preserve">本人已完成策略代码实现和初步回测，具备数据处理、CVXPY 建模及结果整理的基础。现有代码能够连接两个优化阶段，并记录约束误差和求解状态。后续将依据指导意见完善文献论证、检查模型和实验设置，整理必要的表图与论文文字。研究范围限定于当前资产池和历史样本，不预设模型在所有市场阶段均优于比较方法。</w:t>
+            </w:pPr>
+            <w:r>
+              <w:rPr>
+                <w:rFonts w:ascii="Times New Roman" w:hAnsi="Times New Roman" w:eastAsia="宋体" w:cs="Times New Roman"/>
+                <w:color w:val="000000"/>
+                <w:sz w:val="24"/>
+                <w:szCs w:val="24"/>
+              </w:rPr>
+              <w:t>本人已完成策略代码实现和初步回测，具备数据处理、CVXPY 建模及结果整理的基础。现有代码能够连接两个优化阶段，并记录约束误差和求解状态。后续将依据指导意见完善文献论证、检查模型和实验设置，整理必要的表图与论文文字。研究范围限定于当前资产池和历史样本，不预设模型在所有市场阶段均优于比较方法。</w:t>
             </w:r>
           </w:p>
         </w:tc>
@@ -1792,10 +1801,7 @@
         </w:tblCellMar>
       </w:tblPr>
       <w:tblGrid>
-        <w:gridCol w:w="2263"/>
-        <w:gridCol w:w="2273"/>
-        <w:gridCol w:w="2275"/>
-        <w:gridCol w:w="1625"/>
+        <w:gridCol w:w="8436"/>
       </w:tblGrid>
       <w:tr>
         <w:tblPrEx>
@@ -1814,252 +1820,248 @@
             <w:right w:w="108" w:type="dxa"/>
           </w:tblCellMar>
         </w:tblPrEx>
-        <w:trPr>
-          <w:cantSplit w:val="0"/>
-        </w:trPr>
         <w:tc>
           <w:tcPr>
             <w:tcW w:w="8436" w:type="dxa"/>
-            <w:gridSpan w:val="4"/>
             <w:tcMar>
+              <w:top w:w="70" w:type="dxa"/>
               <w:left w:w="120" w:type="dxa"/>
+              <w:bottom w:w="70" w:type="dxa"/>
               <w:right w:w="120" w:type="dxa"/>
-              <w:top w:w="70" w:type="dxa"/>
-              <w:bottom w:w="70" w:type="dxa"/>
             </w:tcMar>
           </w:tcPr>
           <w:p>
             <w:pPr>
-              <w:jc w:val="left"/>
+              <w:keepNext w:val="0"/>
+              <w:keepLines/>
+              <w:widowControl/>
+              <w:snapToGrid w:val="0"/>
               <w:spacing w:before="80" w:after="60" w:line="320" w:lineRule="exact"/>
-              <w:snapToGrid w:val="0"/>
-              <w:widowControl/>
-              <w:keepNext w:val="0"/>
-              <w:keepLines/>
+              <w:jc w:val="left"/>
             </w:pPr>
             <w:r>
               <w:rPr>
                 <w:rFonts w:ascii="Times New Roman" w:hAnsi="Times New Roman" w:eastAsia="仿宋" w:cs="Times New Roman"/>
-                <w:color w:val="000000"/>
-                <w:sz w:val="24"/>
-                <w:szCs w:val="24"/>
                 <w:b/>
-              </w:rPr>
-              <w:t xml:space="preserve">五、研究工作安排及进度</w:t>
-            </w:r>
-          </w:p>
-          <w:p>
-            <w:pPr>
+                <w:color w:val="000000"/>
+                <w:sz w:val="24"/>
+                <w:szCs w:val="24"/>
+              </w:rPr>
+              <w:t>五、研究工作安排及进度</w:t>
+            </w:r>
+          </w:p>
+          <w:p>
+            <w:pPr>
+              <w:keepNext w:val="0"/>
+              <w:widowControl/>
+              <w:snapToGrid w:val="0"/>
+              <w:spacing w:before="0" w:after="45" w:line="320" w:lineRule="exact"/>
+              <w:ind w:firstLine="480"/>
               <w:jc w:val="both"/>
+            </w:pPr>
+            <w:r>
+              <w:rPr>
+                <w:rFonts w:ascii="Times New Roman" w:hAnsi="Times New Roman" w:eastAsia="宋体" w:cs="Times New Roman"/>
+                <w:color w:val="000000"/>
+                <w:sz w:val="24"/>
+                <w:szCs w:val="24"/>
+              </w:rPr>
+              <w:t>目前已形成实习策略的数学表达，完成代码和初步回测。后续工作以开题审定后的阶段安排推进，具体提交日期服从学院通知。</w:t>
+            </w:r>
+          </w:p>
+          <w:p>
+            <w:pPr>
+              <w:keepNext w:val="0"/>
+              <w:keepLines/>
+              <w:widowControl/>
+              <w:snapToGrid w:val="0"/>
+              <w:spacing w:before="80" w:after="60" w:line="320" w:lineRule="exact"/>
+              <w:jc w:val="left"/>
+            </w:pPr>
+            <w:r>
+              <w:rPr>
+                <w:rFonts w:ascii="Times New Roman" w:hAnsi="Times New Roman" w:eastAsia="仿宋" w:cs="Times New Roman"/>
+                <w:b/>
+                <w:color w:val="000000"/>
+                <w:sz w:val="24"/>
+                <w:szCs w:val="24"/>
+              </w:rPr>
+              <w:t>第一阶段  开题后第 1 至 2 周</w:t>
+            </w:r>
+          </w:p>
+          <w:p>
+            <w:pPr>
+              <w:keepNext w:val="0"/>
+              <w:widowControl/>
+              <w:snapToGrid w:val="0"/>
               <w:spacing w:before="0" w:after="45" w:line="320" w:lineRule="exact"/>
-              <w:snapToGrid w:val="0"/>
-              <w:widowControl/>
-              <w:keepNext w:val="0"/>
               <w:ind w:firstLine="480"/>
-            </w:pPr>
-            <w:r>
-              <w:rPr>
-                <w:rFonts w:ascii="Times New Roman" w:hAnsi="Times New Roman" w:eastAsia="宋体" w:cs="Times New Roman"/>
-                <w:color w:val="000000"/>
-                <w:sz w:val="24"/>
-                <w:szCs w:val="24"/>
-              </w:rPr>
-              <w:t xml:space="preserve">目前已形成实习策略的数学表达，完成代码和初步回测。后续工作以开题审定后的阶段安排推进，具体提交日期服从学院通知。</w:t>
-            </w:r>
-          </w:p>
-          <w:p>
-            <w:pPr>
-              <w:jc w:val="left"/>
+              <w:jc w:val="both"/>
+            </w:pPr>
+            <w:r>
+              <w:rPr>
+                <w:rFonts w:ascii="Times New Roman" w:hAnsi="Times New Roman" w:eastAsia="宋体" w:cs="Times New Roman"/>
+                <w:color w:val="000000"/>
+                <w:sz w:val="24"/>
+                <w:szCs w:val="24"/>
+              </w:rPr>
+              <w:t>根据指导意见确定研究范围，继续阅读主要中英文文献，完成模型各项设定与文献的对应说明，重点核实方差和预测收益短缺惩罚的理论依据。</w:t>
+            </w:r>
+          </w:p>
+          <w:p>
+            <w:pPr>
+              <w:keepNext w:val="0"/>
+              <w:keepLines/>
+              <w:widowControl/>
+              <w:snapToGrid w:val="0"/>
               <w:spacing w:before="80" w:after="60" w:line="320" w:lineRule="exact"/>
-              <w:snapToGrid w:val="0"/>
-              <w:widowControl/>
-              <w:keepNext w:val="0"/>
-              <w:keepLines/>
+              <w:jc w:val="left"/>
             </w:pPr>
             <w:r>
               <w:rPr>
                 <w:rFonts w:ascii="Times New Roman" w:hAnsi="Times New Roman" w:eastAsia="仿宋" w:cs="Times New Roman"/>
-                <w:color w:val="000000"/>
-                <w:sz w:val="24"/>
-                <w:szCs w:val="24"/>
                 <w:b/>
-              </w:rPr>
-              <w:t xml:space="preserve">第一阶段  开题后第 1 至 2 周</w:t>
-            </w:r>
-          </w:p>
-          <w:p>
-            <w:pPr>
+                <w:color w:val="000000"/>
+                <w:sz w:val="24"/>
+                <w:szCs w:val="24"/>
+              </w:rPr>
+              <w:t>第二阶段  第 3 至 4 周</w:t>
+            </w:r>
+          </w:p>
+          <w:p>
+            <w:pPr>
+              <w:keepNext w:val="0"/>
+              <w:widowControl/>
+              <w:snapToGrid w:val="0"/>
+              <w:spacing w:before="0" w:after="45" w:line="320" w:lineRule="exact"/>
+              <w:ind w:firstLine="480"/>
               <w:jc w:val="both"/>
+            </w:pPr>
+            <w:r>
+              <w:rPr>
+                <w:rFonts w:ascii="Times New Roman" w:hAnsi="Times New Roman" w:eastAsia="宋体" w:cs="Times New Roman"/>
+                <w:color w:val="000000"/>
+                <w:sz w:val="24"/>
+                <w:szCs w:val="24"/>
+              </w:rPr>
+              <w:t>完善两阶段模型及必要的数学说明，核查 CVXPY 表达、约束和数据使用时点。整理年度参数选择过程，明确模型适用条件。</w:t>
+            </w:r>
+          </w:p>
+          <w:p>
+            <w:pPr>
+              <w:keepNext w:val="0"/>
+              <w:keepLines/>
+              <w:widowControl/>
+              <w:snapToGrid w:val="0"/>
+              <w:spacing w:before="80" w:after="60" w:line="320" w:lineRule="exact"/>
+              <w:jc w:val="left"/>
+            </w:pPr>
+            <w:r>
+              <w:rPr>
+                <w:rFonts w:ascii="Times New Roman" w:hAnsi="Times New Roman" w:eastAsia="仿宋" w:cs="Times New Roman"/>
+                <w:b/>
+                <w:color w:val="000000"/>
+                <w:sz w:val="24"/>
+                <w:szCs w:val="24"/>
+              </w:rPr>
+              <w:t>第三阶段  第 5 至 7 周</w:t>
+            </w:r>
+          </w:p>
+          <w:p>
+            <w:pPr>
+              <w:keepNext w:val="0"/>
+              <w:widowControl/>
+              <w:snapToGrid w:val="0"/>
               <w:spacing w:before="0" w:after="45" w:line="320" w:lineRule="exact"/>
-              <w:snapToGrid w:val="0"/>
-              <w:widowControl/>
-              <w:keepNext w:val="0"/>
               <w:ind w:firstLine="480"/>
-            </w:pPr>
-            <w:r>
-              <w:rPr>
-                <w:rFonts w:ascii="Times New Roman" w:hAnsi="Times New Roman" w:eastAsia="宋体" w:cs="Times New Roman"/>
-                <w:color w:val="000000"/>
-                <w:sz w:val="24"/>
-                <w:szCs w:val="24"/>
-              </w:rPr>
-              <w:t xml:space="preserve">根据指导意见确定研究范围，继续阅读主要中英文文献，完成模型各项设定与文献的对应说明，重点核实方差和预测收益短缺惩罚的理论依据。</w:t>
-            </w:r>
-          </w:p>
-          <w:p>
-            <w:pPr>
-              <w:jc w:val="left"/>
+              <w:jc w:val="both"/>
+            </w:pPr>
+            <w:r>
+              <w:rPr>
+                <w:rFonts w:ascii="Times New Roman" w:hAnsi="Times New Roman" w:eastAsia="宋体" w:cs="Times New Roman"/>
+                <w:color w:val="000000"/>
+                <w:sz w:val="24"/>
+                <w:szCs w:val="24"/>
+              </w:rPr>
+              <w:t>整理主模型与参考组合、简单基准的比较，完成必要的消融及成本检验。结合持仓解释收益与风险差异，保留直接支持结论的图表。</w:t>
+            </w:r>
+          </w:p>
+          <w:p>
+            <w:pPr>
+              <w:keepNext w:val="0"/>
+              <w:keepLines/>
+              <w:widowControl/>
+              <w:snapToGrid w:val="0"/>
               <w:spacing w:before="80" w:after="60" w:line="320" w:lineRule="exact"/>
-              <w:snapToGrid w:val="0"/>
-              <w:widowControl/>
-              <w:keepNext w:val="0"/>
-              <w:keepLines/>
+              <w:jc w:val="left"/>
             </w:pPr>
             <w:r>
               <w:rPr>
                 <w:rFonts w:ascii="Times New Roman" w:hAnsi="Times New Roman" w:eastAsia="仿宋" w:cs="Times New Roman"/>
-                <w:color w:val="000000"/>
-                <w:sz w:val="24"/>
-                <w:szCs w:val="24"/>
                 <w:b/>
-              </w:rPr>
-              <w:t xml:space="preserve">第二阶段  第 3 至 4 周</w:t>
-            </w:r>
-          </w:p>
-          <w:p>
-            <w:pPr>
+                <w:color w:val="000000"/>
+                <w:sz w:val="24"/>
+                <w:szCs w:val="24"/>
+              </w:rPr>
+              <w:t>第四阶段  第 8 至 10 周</w:t>
+            </w:r>
+          </w:p>
+          <w:p>
+            <w:pPr>
+              <w:keepNext w:val="0"/>
+              <w:widowControl/>
+              <w:snapToGrid w:val="0"/>
+              <w:spacing w:before="0" w:after="45" w:line="320" w:lineRule="exact"/>
+              <w:ind w:firstLine="480"/>
               <w:jc w:val="both"/>
+            </w:pPr>
+            <w:r>
+              <w:rPr>
+                <w:rFonts w:ascii="Times New Roman" w:hAnsi="Times New Roman" w:eastAsia="宋体" w:cs="Times New Roman"/>
+                <w:color w:val="000000"/>
+                <w:sz w:val="24"/>
+                <w:szCs w:val="24"/>
+              </w:rPr>
+              <w:t>形成并修订论文完整稿，统一引用、符号和统计口径，提交指导教师审阅。根据反馈调整研究结论与局限说明。</w:t>
+            </w:r>
+          </w:p>
+          <w:p>
+            <w:pPr>
+              <w:keepNext w:val="0"/>
+              <w:keepLines/>
+              <w:widowControl/>
+              <w:snapToGrid w:val="0"/>
+              <w:spacing w:before="80" w:after="60" w:line="320" w:lineRule="exact"/>
+              <w:jc w:val="left"/>
+            </w:pPr>
+            <w:r>
+              <w:rPr>
+                <w:rFonts w:ascii="Times New Roman" w:hAnsi="Times New Roman" w:eastAsia="仿宋" w:cs="Times New Roman"/>
+                <w:b/>
+                <w:color w:val="000000"/>
+                <w:sz w:val="24"/>
+                <w:szCs w:val="24"/>
+              </w:rPr>
+              <w:t>第五阶段  定稿及答辩阶段</w:t>
+            </w:r>
+          </w:p>
+          <w:p>
+            <w:pPr>
+              <w:keepNext w:val="0"/>
+              <w:widowControl/>
+              <w:snapToGrid w:val="0"/>
               <w:spacing w:before="0" w:after="45" w:line="320" w:lineRule="exact"/>
-              <w:snapToGrid w:val="0"/>
-              <w:widowControl/>
-              <w:keepNext w:val="0"/>
               <w:ind w:firstLine="480"/>
-            </w:pPr>
-            <w:r>
-              <w:rPr>
-                <w:rFonts w:ascii="Times New Roman" w:hAnsi="Times New Roman" w:eastAsia="宋体" w:cs="Times New Roman"/>
-                <w:color w:val="000000"/>
-                <w:sz w:val="24"/>
-                <w:szCs w:val="24"/>
-              </w:rPr>
-              <w:t xml:space="preserve">完善两阶段模型及必要的数学说明，核查 CVXPY 表达、约束和数据使用时点。整理年度参数选择过程，明确模型适用条件。</w:t>
-            </w:r>
-          </w:p>
-          <w:p>
-            <w:pPr>
-              <w:jc w:val="left"/>
-              <w:spacing w:before="80" w:after="60" w:line="320" w:lineRule="exact"/>
-              <w:snapToGrid w:val="0"/>
-              <w:widowControl/>
-              <w:keepNext w:val="0"/>
-              <w:keepLines/>
-            </w:pPr>
-            <w:r>
-              <w:rPr>
-                <w:rFonts w:ascii="Times New Roman" w:hAnsi="Times New Roman" w:eastAsia="仿宋" w:cs="Times New Roman"/>
-                <w:color w:val="000000"/>
-                <w:sz w:val="24"/>
-                <w:szCs w:val="24"/>
-                <w:b/>
-              </w:rPr>
-              <w:t xml:space="preserve">第三阶段  第 5 至 7 周</w:t>
-            </w:r>
-          </w:p>
-          <w:p>
-            <w:pPr>
               <w:jc w:val="both"/>
-              <w:spacing w:before="0" w:after="45" w:line="320" w:lineRule="exact"/>
-              <w:snapToGrid w:val="0"/>
-              <w:widowControl/>
-              <w:keepNext w:val="0"/>
-              <w:ind w:firstLine="480"/>
-            </w:pPr>
-            <w:r>
-              <w:rPr>
-                <w:rFonts w:ascii="Times New Roman" w:hAnsi="Times New Roman" w:eastAsia="宋体" w:cs="Times New Roman"/>
-                <w:color w:val="000000"/>
-                <w:sz w:val="24"/>
-                <w:szCs w:val="24"/>
-              </w:rPr>
-              <w:t xml:space="preserve">整理主模型与参考组合、简单基准的比较，完成必要的消融及成本检验。结合持仓解释收益与风险差异，保留直接支持结论的图表。</w:t>
-            </w:r>
-          </w:p>
-          <w:p>
-            <w:pPr>
-              <w:jc w:val="left"/>
-              <w:spacing w:before="80" w:after="60" w:line="320" w:lineRule="exact"/>
-              <w:snapToGrid w:val="0"/>
-              <w:widowControl/>
-              <w:keepNext w:val="0"/>
-              <w:keepLines/>
-            </w:pPr>
-            <w:r>
-              <w:rPr>
-                <w:rFonts w:ascii="Times New Roman" w:hAnsi="Times New Roman" w:eastAsia="仿宋" w:cs="Times New Roman"/>
-                <w:color w:val="000000"/>
-                <w:sz w:val="24"/>
-                <w:szCs w:val="24"/>
-                <w:b/>
-              </w:rPr>
-              <w:t xml:space="preserve">第四阶段  第 8 至 10 周</w:t>
-            </w:r>
-          </w:p>
-          <w:p>
-            <w:pPr>
-              <w:jc w:val="both"/>
-              <w:spacing w:before="0" w:after="45" w:line="320" w:lineRule="exact"/>
-              <w:snapToGrid w:val="0"/>
-              <w:widowControl/>
-              <w:keepNext w:val="0"/>
-              <w:ind w:firstLine="480"/>
-            </w:pPr>
-            <w:r>
-              <w:rPr>
-                <w:rFonts w:ascii="Times New Roman" w:hAnsi="Times New Roman" w:eastAsia="宋体" w:cs="Times New Roman"/>
-                <w:color w:val="000000"/>
-                <w:sz w:val="24"/>
-                <w:szCs w:val="24"/>
-              </w:rPr>
-              <w:t xml:space="preserve">形成并修订论文完整稿，统一引用、符号和统计口径，提交指导教师审阅。根据反馈调整研究结论与局限说明。</w:t>
-            </w:r>
-          </w:p>
-          <w:p>
-            <w:pPr>
-              <w:jc w:val="left"/>
-              <w:spacing w:before="80" w:after="60" w:line="320" w:lineRule="exact"/>
-              <w:snapToGrid w:val="0"/>
-              <w:widowControl/>
-              <w:keepNext w:val="0"/>
-              <w:keepLines/>
-            </w:pPr>
-            <w:r>
-              <w:rPr>
-                <w:rFonts w:ascii="Times New Roman" w:hAnsi="Times New Roman" w:eastAsia="仿宋" w:cs="Times New Roman"/>
-                <w:color w:val="000000"/>
-                <w:sz w:val="24"/>
-                <w:szCs w:val="24"/>
-                <w:b/>
-              </w:rPr>
-              <w:t xml:space="preserve">第五阶段  定稿及答辩阶段</w:t>
-            </w:r>
-          </w:p>
-          <w:p>
-            <w:pPr>
-              <w:jc w:val="both"/>
-              <w:spacing w:before="0" w:after="45" w:line="320" w:lineRule="exact"/>
-              <w:snapToGrid w:val="0"/>
-              <w:widowControl/>
-              <w:keepNext w:val="0"/>
-              <w:ind w:firstLine="480"/>
-            </w:pPr>
-            <w:r>
-              <w:rPr>
-                <w:rFonts w:ascii="Times New Roman" w:hAnsi="Times New Roman" w:eastAsia="宋体" w:cs="Times New Roman"/>
-                <w:color w:val="000000"/>
-                <w:sz w:val="24"/>
-                <w:szCs w:val="24"/>
-              </w:rPr>
-              <w:t xml:space="preserve">按学院安排完成格式检查和定稿，整理代码与结果记录，准备答辩材料及模型、参数和实证结论的说明。</w:t>
+            </w:pPr>
+            <w:r>
+              <w:rPr>
+                <w:rFonts w:ascii="Times New Roman" w:hAnsi="Times New Roman" w:eastAsia="宋体" w:cs="Times New Roman"/>
+                <w:color w:val="000000"/>
+                <w:sz w:val="24"/>
+                <w:szCs w:val="24"/>
+              </w:rPr>
+              <w:t>按学院安排完成格式检查和定稿，整理代码与结果记录，准备答辩材料及模型、参数和实证结论的说明。</w:t>
             </w:r>
           </w:p>
         </w:tc>
@@ -2087,75 +2089,66 @@
         <w:tc>
           <w:tcPr>
             <w:tcW w:w="8436" w:type="dxa"/>
-            <w:gridSpan w:val="4"/>
             <w:tcMar>
+              <w:top w:w="70" w:type="dxa"/>
               <w:left w:w="120" w:type="dxa"/>
+              <w:bottom w:w="70" w:type="dxa"/>
               <w:right w:w="120" w:type="dxa"/>
-              <w:top w:w="70" w:type="dxa"/>
-              <w:bottom w:w="70" w:type="dxa"/>
             </w:tcMar>
           </w:tcPr>
           <w:p>
             <w:pPr>
-              <w:jc w:val="left"/>
+              <w:keepNext w:val="0"/>
+              <w:keepLines/>
+              <w:widowControl/>
+              <w:snapToGrid w:val="0"/>
               <w:spacing w:before="80" w:after="60" w:line="320" w:lineRule="exact"/>
-              <w:snapToGrid w:val="0"/>
-              <w:widowControl/>
-              <w:keepNext w:val="0"/>
-              <w:keepLines/>
+              <w:jc w:val="left"/>
             </w:pPr>
             <w:r>
               <w:rPr>
                 <w:rFonts w:ascii="Times New Roman" w:hAnsi="Times New Roman" w:eastAsia="仿宋" w:cs="Times New Roman"/>
-                <w:color w:val="000000"/>
-                <w:sz w:val="24"/>
-                <w:szCs w:val="24"/>
                 <w:b/>
-              </w:rPr>
-              <w:t xml:space="preserve">指导教师开题意见</w:t>
-            </w:r>
-          </w:p>
-          <w:p>
-            <w:pPr>
+                <w:color w:val="000000"/>
+                <w:sz w:val="24"/>
+                <w:szCs w:val="24"/>
+              </w:rPr>
+              <w:t>指导教师开题意见</w:t>
+            </w:r>
+          </w:p>
+          <w:p>
+            <w:pPr>
+              <w:keepNext w:val="0"/>
+              <w:widowControl/>
+              <w:snapToGrid w:val="0"/>
+              <w:spacing w:before="0" w:after="1600" w:line="320" w:lineRule="exact"/>
+              <w:ind w:firstLine="480"/>
               <w:jc w:val="both"/>
-              <w:spacing w:before="0" w:after="1600" w:line="320" w:lineRule="exact"/>
-              <w:snapToGrid w:val="0"/>
-              <w:widowControl/>
-              <w:keepNext w:val="0"/>
+            </w:pPr>
+          </w:p>
+          <w:p>
+            <w:pPr>
+              <w:keepNext w:val="0"/>
+              <w:widowControl/>
+              <w:snapToGrid w:val="0"/>
+              <w:spacing w:before="0" w:after="45" w:line="320" w:lineRule="exact"/>
               <w:ind w:firstLine="480"/>
-            </w:pPr>
-            <w:r>
-              <w:rPr>
-                <w:rFonts w:ascii="Times New Roman" w:hAnsi="Times New Roman" w:eastAsia="宋体" w:cs="Times New Roman"/>
-                <w:color w:val="000000"/>
-                <w:sz w:val="24"/>
-                <w:szCs w:val="24"/>
-              </w:rPr>
-              <w:t xml:space="preserve"/>
-            </w:r>
-          </w:p>
-          <w:p>
-            <w:pPr>
               <w:jc w:val="both"/>
-              <w:spacing w:before="0" w:after="45" w:line="320" w:lineRule="exact"/>
-              <w:snapToGrid w:val="0"/>
-              <w:widowControl/>
-              <w:keepNext w:val="0"/>
-              <w:ind w:firstLine="480"/>
-            </w:pPr>
-            <w:r>
-              <w:rPr>
-                <w:rFonts w:ascii="Times New Roman" w:hAnsi="Times New Roman" w:eastAsia="宋体" w:cs="Times New Roman"/>
-                <w:color w:val="000000"/>
-                <w:sz w:val="24"/>
-                <w:szCs w:val="24"/>
-              </w:rPr>
-              <w:t xml:space="preserve">指导教师签名                         年    月    日</w:t>
+            </w:pPr>
+            <w:r>
+              <w:rPr>
+                <w:rFonts w:ascii="Times New Roman" w:hAnsi="Times New Roman" w:eastAsia="宋体" w:cs="Times New Roman"/>
+                <w:color w:val="000000"/>
+                <w:sz w:val="24"/>
+                <w:szCs w:val="24"/>
+              </w:rPr>
+              <w:t>指导教师签名                         年    月    日</w:t>
             </w:r>
           </w:p>
         </w:tc>
       </w:tr>
     </w:tbl>
+    <w:p/>
     <w:sectPr>
       <w:pgSz w:w="11906" w:h="16838"/>
       <w:pgMar w:top="1440" w:right="1800" w:bottom="1440" w:left="1800" w:header="851" w:footer="992" w:gutter="0"/>

</xml_diff>